<commit_message>
docs(datenschutz): Bericht v1.2 — aufgewertete Ausgabe + HTML-Viewer
- Konvertierung auf pymdown-extensions umgestellt (superfences, toc, footnotes, smartsymbols)
- Klickbares Inhaltsverzeichnis mit Überschriften-Ankern (permalinks)
- Verbesserte Tabellen-Darstellung (scrollbare Wrapper am Bildschirm, sauberer Seitenumbruch im PDF)
- Echte Fußnoten zu Rechtsquellen (DPF, LG München Google Fonts, § 25 TDDDG)
- Neue browserfreundliche Ansicht datenschutzbericht.html mit fixer Navigations-Seitenleiste
  (Sidebar am Bildschirm, im Druck/PDF ausgeblendet)
- Alle Formate neu erzeugt (md/html/docx/pdf, PDF 15 Seiten)

Co-Authored-By: Claude Opus 4.8 <noreply@anthropic.com>
Claude-Session: https://claude.ai/code/session_01CKE1mDB5VbL15fNho3SwtL
</commit_message>
<xml_diff>
--- a/docs/datenschutz/datenschutzbericht.docx
+++ b/docs/datenschutz/datenschutzbericht.docx
@@ -21,9 +21,7 @@
       </w:r>
       <w:r>
         <w:t xml:space="preserve"> fraesdienst-feind.de</w:t>
-        <w:br/>
-      </w:r>
-      <w:r/>
+      </w:r>
       <w:r>
         <w:rPr>
           <w:b/>
@@ -32,9 +30,7 @@
       </w:r>
       <w:r>
         <w:t xml:space="preserve"> Zusammenfassender Datenschutz-/DSGVO-Statusbericht mit Maßnahmen, Vorlagen und Roadmap</w:t>
-        <w:br/>
-      </w:r>
-      <w:r/>
+      </w:r>
       <w:r>
         <w:rPr>
           <w:b/>
@@ -42,10 +38,8 @@
         <w:t>Zielgruppe:</w:t>
       </w:r>
       <w:r>
-        <w:t xml:space="preserve"> Geschäftsführung, Datenschutzbeauftragte(r) (intern/extern), IT-Verantwortliche, ggf. Aufsichtsbehörde (LDI NRW)</w:t>
-        <w:br/>
-      </w:r>
-      <w:r/>
+        <w:t xml:space="preserve"> Geschäftsführung, Datenschutzbeauftragte® (intern/extern), IT-Verantwortliche, ggf. Aufsichtsbehörde (LDI NRW)</w:t>
+      </w:r>
       <w:r>
         <w:rPr>
           <w:b/>
@@ -54,9 +48,7 @@
       </w:r>
       <w:r>
         <w:t xml:space="preserve"> David Halko (Marketing &amp; Eventmanagement) mit KI-Unterstützung</w:t>
-        <w:br/>
-      </w:r>
-      <w:r/>
+      </w:r>
       <w:r>
         <w:rPr>
           <w:b/>
@@ -65,9 +57,7 @@
       </w:r>
       <w:r>
         <w:t xml:space="preserve"> 14.09.2026</w:t>
-        <w:br/>
-      </w:r>
-      <w:r/>
+      </w:r>
       <w:r>
         <w:rPr>
           <w:b/>
@@ -75,10 +65,26 @@
         <w:t>Version:</w:t>
       </w:r>
       <w:r>
-        <w:t xml:space="preserve"> 1.1 (Entwurf)</w:t>
-        <w:br/>
-      </w:r>
-      <w:r/>
+        <w:t xml:space="preserve"> 1.2 (Entwurf)</w:t>
+      </w:r>
+      <w:r>
+        <w:rPr>
+          <w:b/>
+        </w:rPr>
+        <w:t>Änderungsvermerk v1.2:</w:t>
+      </w:r>
+      <w:r>
+        <w:t xml:space="preserve"> Aufgewertete Ausgabe (klickbares Inhaltsverzeichnis mit Anker-Links, verbesserte Tabellen-Darstellung, </w:t>
+      </w:r>
+      <w:r>
+        <w:rPr>
+          <w:b/>
+        </w:rPr>
+        <w:t>Fußnoten</w:t>
+      </w:r>
+      <w:r>
+        <w:t xml:space="preserve"> zu Rechtsquellen) sowie zusätzliche browserfreundliche HTML-Ansicht mit Navigations-Seitenleiste.</w:t>
+      </w:r>
       <w:r>
         <w:rPr>
           <w:b/>
@@ -123,9 +129,7 @@
       </w:r>
       <w:r>
         <w:t>-Ableitungslogik, 4-spaltige Offene-Fragen-Tabelle, ergänzte kostengünstige/Open-Source-Optionen.</w:t>
-        <w:br/>
-      </w:r>
-      <w:r/>
+      </w:r>
       <w:r>
         <w:rPr>
           <w:b/>
@@ -155,11 +159,7 @@
         <w:t>Rechtlicher Hinweis / Haftungsausschluss:</w:t>
       </w:r>
       <w:r>
-        <w:t xml:space="preserve"> Dieser Bericht ist eine praxisorientierte</w:t>
-        <w:br/>
-      </w:r>
-      <w:r>
-        <w:t xml:space="preserve">fachliche Aufbereitung des Datenschutz-Status und </w:t>
+        <w:t xml:space="preserve"> Dieser Bericht ist eine praxisorientierte fachliche Aufbereitung des Datenschutz-Status und </w:t>
       </w:r>
       <w:r>
         <w:rPr>
@@ -168,40 +168,13 @@
         <w:t>keine Rechtsberatung</w:t>
       </w:r>
       <w:r>
-        <w:t>. Er ersetzt weder</w:t>
-        <w:br/>
-      </w:r>
-      <w:r>
-        <w:t>die Prüfung durch einen Datenschutzbeauftragten noch durch einen Fachanwalt für</w:t>
-        <w:br/>
-      </w:r>
-      <w:r>
-        <w:t>IT-/Datenschutzrecht. Alle enthaltenen Muster (Datenschutzerklärung, AVV-Klauseln,</w:t>
-        <w:br/>
-      </w:r>
-      <w:r>
-        <w:t>Einwilligungen, Meldevorlagen, Antwortschreiben) sind Textbausteine, die vor produktivem</w:t>
-        <w:br/>
-      </w:r>
-      <w:r>
-        <w:t>Einsatz rechtlich zu prüfen und an die tatsächlichen Verhältnisse anzupassen sind. Bei</w:t>
-        <w:br/>
-      </w:r>
-      <w:r>
-        <w:t xml:space="preserve">rechtlichen/vertraglichen Fragen gilt durchgängig: </w:t>
+        <w:t xml:space="preserve">. Er ersetzt weder die Prüfung durch einen Datenschutzbeauftragten noch durch einen Fachanwalt für IT-/Datenschutzrecht. Alle enthaltenen Muster (Datenschutzerklärung, AVV-Klauseln, Einwilligungen, Meldevorlagen, Antwortschreiben) sind Textbausteine, die vor produktivem Einsatz rechtlich zu prüfen und an die tatsächlichen Verhältnisse anzupassen sind. Bei rechtlichen/vertraglichen Fragen gilt durchgängig: </w:t>
       </w:r>
       <w:r>
         <w:rPr>
           <w:b/>
         </w:rPr>
-        <w:t>„Bitte Rechtsabteilung / Fachanwalt für</w:t>
-        <w:br/>
-      </w:r>
-      <w:r>
-        <w:rPr>
-          <w:b/>
-        </w:rPr>
-        <w:t>IT-Recht prüfen."</w:t>
+        <w:t>„Bitte Rechtsabteilung / Fachanwalt für IT-Recht prüfen."</w:t>
       </w:r>
       <w:r/>
     </w:p>
@@ -227,11 +200,7 @@
         <w:t>-Werten:</w:t>
       </w:r>
       <w:r>
-        <w:t xml:space="preserve"> Dieser Bericht sollte laut Auftrag aus</w:t>
-        <w:br/>
-      </w:r>
-      <w:r>
-        <w:t>Umgebungsvariablen (</w:t>
+        <w:t xml:space="preserve"> Dieser Bericht sollte laut Auftrag aus Umgebungsvariablen (</w:t>
       </w:r>
       <w:r>
         <w:rPr>
@@ -268,9 +237,7 @@
       </w:r>
       <w:r>
         <w:t>,</w:t>
-        <w:br/>
-      </w:r>
-      <w:r/>
+      </w:r>
       <w:r>
         <w:rPr>
           <w:rFonts w:ascii="Courier" w:hAnsi="Courier"/>
@@ -298,12 +265,6 @@
           <w:b/>
         </w:rPr>
         <w:t>, keine</w:t>
-        <w:br/>
-      </w:r>
-      <w:r>
-        <w:rPr>
-          <w:b/>
-        </w:rPr>
       </w:r>
       <w:r>
         <w:rPr>
@@ -328,30 +289,17 @@
         <w:t>config.example.yaml</w:t>
       </w:r>
       <w:r>
-        <w:t>).</w:t>
-        <w:br/>
-      </w:r>
-      <w:r>
-        <w:t xml:space="preserve">Die im Auftrag beispielhaft genannten Werte („Hetzner", „WordPress") sind daher </w:t>
+        <w:t xml:space="preserve">). Die im Auftrag beispielhaft genannten Werte („Hetzner", „WordPress") sind daher </w:t>
       </w:r>
       <w:r>
         <w:rPr>
           <w:b/>
         </w:rPr>
-        <w:t>Beispiele,</w:t>
-        <w:br/>
-      </w:r>
-      <w:r>
-        <w:rPr>
-          <w:b/>
-        </w:rPr>
-        <w:t>keine bestätigten Daten</w:t>
+        <w:t>Beispiele, keine bestätigten Daten</w:t>
       </w:r>
       <w:r>
         <w:t>. Alle aus diesen Variablen ableitbaren Angaben sind deshalb als</w:t>
-        <w:br/>
-      </w:r>
-      <w:r/>
+      </w:r>
       <w:r>
         <w:rPr>
           <w:rFonts w:ascii="Courier" w:hAnsi="Courier"/>
@@ -369,15 +317,7 @@
         <w:t>{{PLATZHALTER}}</w:t>
       </w:r>
       <w:r>
-        <w:t xml:space="preserve"> sowie den Fragenkatalog (Kap. 16/17)</w:t>
-        <w:br/>
-      </w:r>
-      <w:r>
-        <w:t>als offene Punkte geführt. Verifizierte Fakten stammen aus der internen SEO-/Lead-Reporting-</w:t>
-        <w:br/>
-      </w:r>
-      <w:r>
-        <w:t>Codebasis (</w:t>
+        <w:t xml:space="preserve"> sowie den Fragenkatalog (Kap. 16/17) als offene Punkte geführt. Verifizierte Fakten stammen aus der internen SEO-/Lead-Reporting- Codebasis (</w:t>
       </w:r>
       <w:r>
         <w:rPr>
@@ -426,11 +366,7 @@
         <w:t>Platzhalter-Mechanismus:</w:t>
       </w:r>
       <w:r>
-        <w:t xml:space="preserve"> Alle Vorlagen und mehrere Textstellen enthalten Platzhalter in</w:t>
-        <w:br/>
-      </w:r>
-      <w:r>
-        <w:t xml:space="preserve">doppelten geschweiften Klammern, z. B. </w:t>
+        <w:t xml:space="preserve"> Alle Vorlagen und mehrere Textstellen enthalten Platzhalter in doppelten geschweiften Klammern, z. B. </w:t>
       </w:r>
       <w:r>
         <w:rPr>
@@ -458,9 +394,7 @@
       </w:r>
       <w:r>
         <w:t>,</w:t>
-        <w:br/>
-      </w:r>
-      <w:r/>
+      </w:r>
       <w:r>
         <w:rPr>
           <w:rFonts w:ascii="Courier" w:hAnsi="Courier"/>
@@ -495,14 +429,8 @@
         <w:t>{{USt-IdNr}}</w:t>
       </w:r>
       <w:r>
-        <w:t>. Vor produktivem Einsatz</w:t>
-        <w:br/>
-      </w:r>
-      <w:r>
-        <w:t>per Suchen-&amp;-Ersetzen mit echten Werten füllen. Eine vollständige Platzhalter-Liste steht in</w:t>
-        <w:br/>
-      </w:r>
-      <w:r/>
+        <w:t>. Vor produktivem Einsatz per Suchen-&amp;-Ersetzen mit echten Werten füllen. Eine vollständige Platzhalter-Liste steht in</w:t>
+      </w:r>
       <w:r>
         <w:rPr>
           <w:b/>
@@ -923,11 +851,7 @@
         <w:t>.env</w:t>
       </w:r>
       <w:r>
-        <w:t>/Konfiguration automatisch mit realen</w:t>
-        <w:br/>
-      </w:r>
-      <w:r>
-        <w:t xml:space="preserve">Werten befüllt werden kann. Da aktuell </w:t>
+        <w:t xml:space="preserve">/Konfiguration automatisch mit realen Werten befüllt werden kann. Da aktuell </w:t>
       </w:r>
       <w:r>
         <w:rPr>
@@ -936,11 +860,7 @@
         <w:t>keine</w:t>
       </w:r>
       <w:r>
-        <w:t xml:space="preserve"> solchen Werte vorliegen, dokumentiert dieser</w:t>
-        <w:br/>
-      </w:r>
-      <w:r>
-        <w:t xml:space="preserve">Abschnitt die </w:t>
+        <w:t xml:space="preserve"> solchen Werte vorliegen, dokumentiert dieser Abschnitt die </w:t>
       </w:r>
       <w:r>
         <w:rPr>
@@ -1414,9 +1334,7 @@
       </w:r>
       <w:r>
         <w:t xml:space="preserve"> Wäre</w:t>
-        <w:br/>
-      </w:r>
-      <w:r/>
+      </w:r>
       <w:r>
         <w:rPr>
           <w:rFonts w:ascii="Courier" w:hAnsi="Courier"/>
@@ -1424,14 +1342,8 @@
         <w:t>HOSTING_PROVIDER=Hetzner</w:t>
       </w:r>
       <w:r>
-        <w:t xml:space="preserve"> gesetzt, folgte: Verarbeitung in Deutschland (kein Drittstaat),</w:t>
-        <w:br/>
-      </w:r>
-      <w:r>
-        <w:t>AVV nach Art. 28 verfügbar (Hetzner stellt AVV bereit), TOM-Nachweis über ISO 27001 des Anbieters.</w:t>
-        <w:br/>
-      </w:r>
-      <w:r/>
+        <w:t xml:space="preserve"> gesetzt, folgte: Verarbeitung in Deutschland (kein Drittstaat), AVV nach Art. 28 verfügbar (Hetzner stellt AVV bereit), TOM-Nachweis über ISO 27001 des Anbieters.</w:t>
+      </w:r>
       <w:r>
         <w:rPr>
           <w:i/>
@@ -1473,32 +1385,13 @@
     <w:p>
       <w:r/>
       <w:r>
-        <w:t>{{COMPANY_NAME}} verarbeitet als B2B-Fertigungsbetrieb (CNC-Fräsen / Lohnfertigung) überwiegend</w:t>
-        <w:br/>
-      </w:r>
-      <w:r>
-        <w:t>Kunden-, Auftrags-, Lieferanten- und Beschäftigtendaten sowie Website-Besucherdaten. Das</w:t>
-        <w:br/>
-      </w:r>
-      <w:r>
-        <w:t>Datenschutzniveau ist in Teilbereichen solide (DSGVO-bewusste Trennung von Rohdaten und Code,</w:t>
-        <w:br/>
-      </w:r>
-      <w:r>
-        <w:t xml:space="preserve">kein Datenverkauf, überschaubare Verarbeitungslandschaft), es fehlen jedoch </w:t>
+        <w:t xml:space="preserve">{{COMPANY_NAME}} verarbeitet als B2B-Fertigungsbetrieb (CNC-Fräsen / Lohnfertigung) überwiegend Kunden-, Auftrags-, Lieferanten- und Beschäftigtendaten sowie Website-Besucherdaten. Das Datenschutzniveau ist in Teilbereichen solide (DSGVO-bewusste Trennung von Rohdaten und Code, kein Datenverkauf, überschaubare Verarbeitungslandschaft), es fehlen jedoch </w:t>
       </w:r>
       <w:r>
         <w:rPr>
           <w:b/>
         </w:rPr>
-        <w:t>zentrale</w:t>
-        <w:br/>
-      </w:r>
-      <w:r>
-        <w:rPr>
-          <w:b/>
-        </w:rPr>
-        <w:t>Pflichtdokumente und Nachweise</w:t>
+        <w:t>zentrale Pflichtdokumente und Nachweise</w:t>
       </w:r>
       <w:r>
         <w:t>.</w:t>
@@ -1530,15 +1423,7 @@
         <w:t>Website-Tracking ohne rechtssicheres Consent (hoch).</w:t>
       </w:r>
       <w:r>
-        <w:t xml:space="preserve"> Google Analytics 4 ist nachweislich</w:t>
-        <w:br/>
-      </w:r>
-      <w:r>
-        <w:t>im Einsatz. Ohne vorheriges Opt-in per Consent-Banner (§ 25 TDDDG) und ohne aktuelle</w:t>
-        <w:br/>
-      </w:r>
-      <w:r>
-        <w:t>Datenschutzerklärung drohen Abmahnungen/Bußgelder.</w:t>
+        <w:t xml:space="preserve"> Google Analytics 4 ist nachweislich im Einsatz. Ohne vorheriges Opt-in per Consent-Banner (§ 25 TDDDG) und ohne aktuelle Datenschutzerklärung drohen Abmahnungen/Bußgelder.</w:t>
       </w:r>
       <w:r/>
     </w:p>
@@ -1571,11 +1456,7 @@
         <w:t>US-Datentransfer (mittel–hoch).</w:t>
       </w:r>
       <w:r>
-        <w:t xml:space="preserve"> Google übermittelt in die USA; Rechtsgrundlage</w:t>
-        <w:br/>
-      </w:r>
-      <w:r>
-        <w:t>EU-US Data Privacy Framework dokumentierbar, aber zu belegen.</w:t>
+        <w:t xml:space="preserve"> Google übermittelt in die USA; Rechtsgrundlage EU-US Data Privacy Framework dokumentierbar, aber zu belegen.</w:t>
       </w:r>
       <w:r/>
     </w:p>
@@ -1619,15 +1500,7 @@
         <w:t>Top-Sofortmaßnahmen (0–3 Monate):</w:t>
       </w:r>
       <w:r>
-        <w:t xml:space="preserve"> Consent-Banner mit Opt-in vor GA4; Datenschutzerklärung</w:t>
-        <w:br/>
-      </w:r>
-      <w:r>
-        <w:t>und Impressum aktualisieren; VVT erstellen; AV-Verträge einholen/prüfen; Löschkonzept und</w:t>
-        <w:br/>
-      </w:r>
-      <w:r>
-        <w:t>Datenpannen-Meldeprozess; klären, ob ein DSB zu benennen ist.</w:t>
+        <w:t xml:space="preserve"> Consent-Banner mit Opt-in vor GA4; Datenschutzerklärung und Impressum aktualisieren; VVT erstellen; AV-Verträge einholen/prüfen; Löschkonzept und Datenpannen-Meldeprozess; klären, ob ein DSB zu benennen ist.</w:t>
       </w:r>
       <w:r/>
     </w:p>
@@ -1640,24 +1513,11 @@
         <w:rPr>
           <w:b/>
         </w:rPr>
-        <w:t>Dokumentation, Consent-Konfiguration und</w:t>
-        <w:br/>
-      </w:r>
-      <w:r>
-        <w:rPr>
-          <w:b/>
-        </w:rPr>
-        <w:t>Prozessen</w:t>
-      </w:r>
-      <w:r>
-        <w:t xml:space="preserve"> — nicht in teurer Technik. Mit überschaubarem Aufwand (inkl. Open-Source-Optionen)</w:t>
-        <w:br/>
-      </w:r>
-      <w:r>
-        <w:t>ist innerhalb von 12 Monaten ein belastbares Konformitätsniveau erreichbar. Umsetzung siehe</w:t>
-        <w:br/>
-      </w:r>
-      <w:r/>
+        <w:t>Dokumentation, Consent-Konfiguration und Prozessen</w:t>
+      </w:r>
+      <w:r>
+        <w:t xml:space="preserve"> — nicht in teurer Technik. Mit überschaubarem Aufwand (inkl. Open-Source-Optionen) ist innerhalb von 12 Monaten ein belastbares Konformitätsniveau erreichbar. Umsetzung siehe</w:t>
+      </w:r>
       <w:r>
         <w:rPr>
           <w:b/>
@@ -1732,11 +1592,7 @@
         <w:t>Verifiziert (aus interner Codebasis):</w:t>
       </w:r>
       <w:r>
-        <w:t xml:space="preserve"> Auftritt als „E. Feind GmbH" / „Fräsdienst Feind",</w:t>
-        <w:br/>
-      </w:r>
-      <w:r>
-        <w:t xml:space="preserve">Domain </w:t>
+        <w:t xml:space="preserve"> Auftritt als „E. Feind GmbH" / „Fräsdienst Feind", Domain </w:t>
       </w:r>
       <w:r>
         <w:rPr>
@@ -1754,11 +1610,7 @@
         <w:t>CNC-Fräsen, Lohnfertigung</w:t>
       </w:r>
       <w:r>
-        <w:t>, Werkstoffe</w:t>
-        <w:br/>
-      </w:r>
-      <w:r>
-        <w:t xml:space="preserve">(Aluminium, Kunststoff, Edelstahl, POM, Messing, Titan), </w:t>
+        <w:t xml:space="preserve">, Werkstoffe (Aluminium, Kunststoff, Edelstahl, POM, Messing, Titan), </w:t>
       </w:r>
       <w:r>
         <w:rPr>
@@ -1768,9 +1620,7 @@
       </w:r>
       <w:r>
         <w:t>, Fokus</w:t>
-        <w:br/>
-      </w:r>
-      <w:r/>
+      </w:r>
       <w:r>
         <w:rPr>
           <w:b/>
@@ -1806,11 +1656,7 @@
         <w:t>&lt; 20 Personen</w:t>
       </w:r>
       <w:r>
-        <w:t>, die ständig automatisiert personenbezogene Daten</w:t>
-        <w:br/>
-      </w:r>
-      <w:r>
-        <w:t>verarbeiten → keine gesetzliche DSB-Pflicht nach § 38 BDSG (bestätigen, siehe Kap. 3).</w:t>
+        <w:t>, die ständig automatisiert personenbezogene Daten verarbeiten → keine gesetzliche DSB-Pflicht nach § 38 BDSG (bestätigen, siehe Kap. 3).</w:t>
       </w:r>
       <w:r/>
     </w:p>
@@ -1846,11 +1692,7 @@
         <w:t>LDI NRW</w:t>
       </w:r>
       <w:r>
-        <w:t xml:space="preserve"> (bei Meldung Bundesland</w:t>
-        <w:br/>
-      </w:r>
-      <w:r>
-        <w:t>verifizieren).</w:t>
+        <w:t xml:space="preserve"> (bei Meldung Bundesland verifizieren).</w:t>
       </w:r>
       <w:r/>
     </w:p>
@@ -1877,11 +1719,7 @@
         <w:t>besonderen Kategorien</w:t>
       </w:r>
       <w:r>
-        <w:t xml:space="preserve"> (Art. 9) zu Kunden; im Beschäftigtenkontext nur</w:t>
-        <w:br/>
-      </w:r>
-      <w:r>
-        <w:t>begrenzt Gesundheitsdaten (AU-Bescheinigungen).</w:t>
+        <w:t xml:space="preserve"> (Art. 9) zu Kunden; im Beschäftigtenkontext nur begrenzt Gesundheitsdaten (AU-Bescheinigungen).</w:t>
       </w:r>
       <w:r/>
     </w:p>
@@ -1934,19 +1772,7 @@
         <w:t>Marketing &amp; Eventmanager</w:t>
       </w:r>
       <w:r>
-        <w:t>. Datenschutzrelevante Berührungspunkte: Website und</w:t>
-        <w:br/>
-      </w:r>
-      <w:r>
-        <w:t>Marketing-Tools (Analytics, ggf. Newsletter, Social Media), Interessenten-/Lead-Daten</w:t>
-        <w:br/>
-      </w:r>
-      <w:r>
-        <w:t>(Kontaktformular, Messe), Auswahl externer Dienstleister (Web-Agentur, Tools), Marketing-Content</w:t>
-        <w:br/>
-      </w:r>
-      <w:r>
-        <w:t>mit möglichem Personenbezug (Referenzen, Event-Fotos).</w:t>
+        <w:t>. Datenschutzrelevante Berührungspunkte: Website und Marketing-Tools (Analytics, ggf. Newsletter, Social Media), Interessenten-/Lead-Daten (Kontaktformular, Messe), Auswahl externer Dienstleister (Web-Agentur, Tools), Marketing-Content mit möglichem Personenbezug (Referenzen, Event-Fotos).</w:t>
       </w:r>
       <w:r/>
       <w:r/>
@@ -1974,18 +1800,13 @@
         <w:t>nicht</w:t>
       </w:r>
       <w:r>
-        <w:t xml:space="preserve"> DSB; die Marketing-Rolle ist wegen Interessenkonflikt für die</w:t>
-        <w:br/>
-      </w:r>
-      <w:r>
-        <w:t xml:space="preserve">DSB-Funktion ungeeignet. Empfohlene Rolle: </w:t>
+        <w:t xml:space="preserve"> DSB; die Marketing-Rolle ist wegen Interessenkonflikt für die DSB-Funktion ungeeignet. Empfohlene Rolle: </w:t>
       </w:r>
       <w:r>
         <w:rPr>
           <w:b/>
         </w:rPr>
         <w:t>Prozessverantwortlicher „Marketing &amp; Website"</w:t>
-        <w:br/>
       </w:r>
       <w:r>
         <w:t>(siehe Rollenmatrix, Kap. 13).</w:t>
@@ -2294,6 +2115,18 @@
               </w:rPr>
               <w:t>§ 25 TDDDG</w:t>
             </w:r>
+            <w:r>
+              <w:t xml:space="preserve"> </w:t>
+            </w:r>
+            <w:hyperlink r:id="rId28">
+              <w:r>
+                <w:rPr>
+                  <w:color w:val="0000EE"/>
+                  <w:u w:val="single"/>
+                </w:rPr>
+                <w:t>3</w:t>
+              </w:r>
+            </w:hyperlink>
             <w:r>
               <w:t xml:space="preserve"> (vormals TTDSG)</w:t>
             </w:r>
@@ -3215,9 +3048,7 @@
       </w:r>
       <w:r>
         <w:t xml:space="preserve"> Die technische Verarbeitung ist überschaubar; der Handlungsbedarf liegt in</w:t>
-        <w:br/>
-      </w:r>
-      <w:r/>
+      </w:r>
       <w:r>
         <w:rPr>
           <w:b/>
@@ -4440,15 +4271,7 @@
         <w:t>Eingang:</w:t>
       </w:r>
       <w:r>
-        <w:t xml:space="preserve"> Website-Kontaktformular · E-Mail · Telefon · Messe/persönlich · Papierdokumente</w:t>
-        <w:br/>
-      </w:r>
-      <w:r>
-        <w:t>(Zeichnungen, Lieferscheine) · Bewerbungen · Maschinen-/Fertigungsdaten (CAD — i. d. R. kein</w:t>
-        <w:br/>
-      </w:r>
-      <w:r>
-        <w:t>Personenbezug).</w:t>
+        <w:t xml:space="preserve"> Website-Kontaktformular · E-Mail · Telefon · Messe/persönlich · Papierdokumente (Zeichnungen, Lieferscheine) · Bewerbungen · Maschinen-/Fertigungsdaten (CAD — i. d. R. kein Personenbezug).</w:t>
       </w:r>
       <w:r/>
     </w:p>
@@ -4461,22 +4284,13 @@
         <w:t>Ausgang:</w:t>
       </w:r>
       <w:r>
-        <w:t xml:space="preserve"> Steuerberater/Lohnbüro · Finanzamt/SV-Träger (gesetzlich) · Versand/Logistik ·</w:t>
-        <w:br/>
-      </w:r>
-      <w:r>
-        <w:t>Zahlungsdienstleister/Bank · Google (Analytics/Search Console) · Hosting-Provider ·</w:t>
-        <w:br/>
-      </w:r>
-      <w:r>
-        <w:t xml:space="preserve">IT-Support/Fernwartung · ggf. Newsletter-Tools · GitHub (nur Code/Konfiguration, </w:t>
+        <w:t xml:space="preserve"> Steuerberater/Lohnbüro · Finanzamt/SV-Träger (gesetzlich) · Versand/Logistik · Zahlungsdienstleister/Bank · Google (Analytics/Search Console) · Hosting-Provider · IT-Support/Fernwartung · ggf. Newsletter-Tools · GitHub (nur Code/Konfiguration, </w:t>
       </w:r>
       <w:r>
         <w:rPr>
           <w:b/>
         </w:rPr>
         <w:t>keine</w:t>
-        <w:br/>
       </w:r>
       <w:r>
         <w:t xml:space="preserve">produktiven CRM-Rohdaten — durch </w:t>
@@ -5111,11 +4925,7 @@
         <w:t>USA</w:t>
       </w:r>
       <w:r>
-        <w:t xml:space="preserve"> möglich.</w:t>
-        <w:br/>
-      </w:r>
-      <w:r>
-        <w:t xml:space="preserve">Rechtsgrundlage: </w:t>
+        <w:t xml:space="preserve"> möglich. Rechtsgrundlage: </w:t>
       </w:r>
       <w:r>
         <w:rPr>
@@ -5124,11 +4934,19 @@
         <w:t>EU-US Data Privacy Framework</w:t>
       </w:r>
       <w:r>
-        <w:t xml:space="preserve"> (Angemessenheitsbeschluss vom 10.07.2023);</w:t>
-        <w:br/>
-      </w:r>
-      <w:r>
-        <w:t xml:space="preserve">Google LLC ist DPF-zertifiziert; SCC als Auffanglösung. </w:t>
+        <w:t xml:space="preserve"> (Angemessenheitsbeschluss vom 10.07.2023)</w:t>
+      </w:r>
+      <w:hyperlink r:id="rId29">
+        <w:r>
+          <w:rPr>
+            <w:color w:val="0000EE"/>
+            <w:u w:val="single"/>
+          </w:rPr>
+          <w:t>1</w:t>
+        </w:r>
+      </w:hyperlink>
+      <w:r>
+        <w:t xml:space="preserve">; Google LLC ist DPF-zertifiziert; SCC als Auffanglösung. </w:t>
       </w:r>
       <w:r>
         <w:rPr>
@@ -5152,11 +4970,7 @@
         <w:t>GitHub (Microsoft):</w:t>
       </w:r>
       <w:r>
-        <w:t xml:space="preserve"> USA möglich; enthält nur Code/Konfiguration, keine produktiven</w:t>
-        <w:br/>
-      </w:r>
-      <w:r>
-        <w:t>personenbezogenen Rohdaten.</w:t>
+        <w:t xml:space="preserve"> USA möglich; enthält nur Code/Konfiguration, keine produktiven personenbezogenen Rohdaten.</w:t>
       </w:r>
       <w:r/>
     </w:p>
@@ -5183,11 +4997,7 @@
         <w:t>Offene Frage:</w:t>
       </w:r>
       <w:r>
-        <w:t xml:space="preserve"> Standort/Drittstaatenbezug</w:t>
-        <w:br/>
-      </w:r>
-      <w:r>
-        <w:t>zu verifizieren.</w:t>
+        <w:t xml:space="preserve"> Standort/Drittstaatenbezug zu verifizieren.</w:t>
       </w:r>
       <w:r/>
       <w:r/>
@@ -5212,11 +5022,7 @@
     <w:p>
       <w:r/>
       <w:r>
-        <w:t>Empfohlene TOM nach Art. 32 DSGVO, mit Priorität (H/M/N), Aufwand und ggf. kostengünstiger/</w:t>
-        <w:br/>
-      </w:r>
-      <w:r>
-        <w:t>Open-Source-Option (neutral, keine Kaufempfehlung).</w:t>
+        <w:t>Empfohlene TOM nach Art. 32 DSGVO, mit Priorität (H/M/N), Aufwand und ggf. kostengünstiger/ Open-Source-Option (neutral, keine Kaufempfehlung).</w:t>
       </w:r>
       <w:r/>
     </w:p>
@@ -6829,15 +6635,7 @@
     <w:p>
       <w:r/>
       <w:r>
-        <w:t>Pflicht bei „voraussichtlich hohem Risiko": systematische umfangreiche Überwachung, umfangreiche</w:t>
-        <w:br/>
-      </w:r>
-      <w:r>
-        <w:t>Verarbeitung besonderer Kategorien, systematisches Scoring/Profiling — sowie bei Verarbeitungen</w:t>
-        <w:br/>
-      </w:r>
-      <w:r>
-        <w:t>auf der Muss-Liste der Aufsichtsbehörden.</w:t>
+        <w:t>Pflicht bei „voraussichtlich hohem Risiko": systematische umfangreiche Überwachung, umfangreiche Verarbeitung besonderer Kategorien, systematisches Scoring/Profiling — sowie bei Verarbeitungen auf der Muss-Liste der Aufsichtsbehörden.</w:t>
       </w:r>
       <w:r/>
       <w:r/>
@@ -6865,15 +6663,7 @@
         <w:t>keine DPIA zwingend</w:t>
       </w:r>
       <w:r>
-        <w:t xml:space="preserve"> — kein</w:t>
-        <w:br/>
-      </w:r>
-      <w:r>
-        <w:t>großflächiges Tracking/Scoring, keine umfangreiche Verarbeitung besonderer Kategorien.</w:t>
-        <w:br/>
-      </w:r>
-      <w:r>
-        <w:t xml:space="preserve">GA4-Website-Analyse = </w:t>
+        <w:t xml:space="preserve"> — kein großflächiges Tracking/Scoring, keine umfangreiche Verarbeitung besonderer Kategorien. GA4-Website-Analyse = </w:t>
       </w:r>
       <w:r>
         <w:rPr>
@@ -6888,14 +6678,7 @@
         <w:rPr>
           <w:b/>
         </w:rPr>
-        <w:t>→</w:t>
-        <w:br/>
-      </w:r>
-      <w:r>
-        <w:rPr>
-          <w:b/>
-        </w:rPr>
-        <w:t>Kurz-Schwellwertprüfung dokumentieren</w:t>
+        <w:t>→ Kurz-Schwellwertprüfung dokumentieren</w:t>
       </w:r>
       <w:r>
         <w:t xml:space="preserve"> (Nachweis, dass geprüft und verneint wurde).</w:t>
@@ -6964,9 +6747,7 @@
       </w:r>
       <w:r>
         <w:t xml:space="preserve"> (Kundenverwaltung, CAD-Dateien, Fernwartung) siehe</w:t>
-        <w:br/>
-      </w:r>
-      <w:r/>
+      </w:r>
       <w:r>
         <w:rPr>
           <w:b/>
@@ -7029,11 +6810,7 @@
         <w:t>Sofortmaßnahmen &amp; forensische Sicherung:</w:t>
       </w:r>
       <w:r>
-        <w:t xml:space="preserve"> System isolieren, Logs/Beweise sichern, Umfang</w:t>
-        <w:br/>
-      </w:r>
-      <w:r>
-        <w:t>eingrenzen.</w:t>
+        <w:t xml:space="preserve"> System isolieren, Logs/Beweise sichern, Umfang eingrenzen.</w:t>
       </w:r>
       <w:r/>
     </w:p>
@@ -7078,11 +6855,7 @@
         <w:t>innerhalb 72 Stunden</w:t>
       </w:r>
       <w:r>
-        <w:t xml:space="preserve"> (LDI NRW);</w:t>
-        <w:br/>
-      </w:r>
-      <w:r>
-        <w:t>Verzögerung begründen.</w:t>
+        <w:t xml:space="preserve"> (LDI NRW); Verzögerung begründen.</w:t>
       </w:r>
       <w:r/>
     </w:p>
@@ -7188,9 +6961,7 @@
       </w:r>
       <w:r>
         <w:t>;</w:t>
-        <w:br/>
-      </w:r>
-      <w:r/>
+      </w:r>
       <w:r>
         <w:rPr>
           <w:b/>
@@ -7495,18 +7266,13 @@
         <w:t>Identität prüfen</w:t>
       </w:r>
       <w:r>
-        <w:t xml:space="preserve"> (verhältnismäßig) →</w:t>
-        <w:br/>
-      </w:r>
-      <w:r>
-        <w:t xml:space="preserve">Betroffene(n)/Daten ermitteln → Antwort erstellen (ggf. mit DSB) → fristgerecht </w:t>
+        <w:t xml:space="preserve"> (verhältnismäßig) → Betroffene(n)/Daten ermitteln → Antwort erstellen (ggf. mit DSB) → fristgerecht </w:t>
       </w:r>
       <w:r>
         <w:rPr>
           <w:b/>
         </w:rPr>
         <w:t>kostenfrei</w:t>
-        <w:br/>
       </w:r>
       <w:r>
         <w:t>antworten → dokumentieren.</w:t>
@@ -7599,11 +7365,7 @@
         <w:t>Opt-in vor</w:t>
       </w:r>
       <w:r>
-        <w:t xml:space="preserve"> dem Laden nicht notwendiger Technologien (GA4!),</w:t>
-        <w:br/>
-      </w:r>
-      <w:r>
-        <w:t xml:space="preserve">granular, Ablehnen so einfach wie Akzeptieren, Widerruf jederzeit — Texte </w:t>
+        <w:t xml:space="preserve"> dem Laden nicht notwendiger Technologien (GA4!), granular, Ablehnen so einfach wie Akzeptieren, Widerruf jederzeit — Texte </w:t>
       </w:r>
       <w:r>
         <w:rPr>
@@ -7613,9 +7375,7 @@
       </w:r>
       <w:r>
         <w:t>.</w:t>
-        <w:br/>
-      </w:r>
-      <w:r/>
+      </w:r>
       <w:r>
         <w:rPr>
           <w:i/>
@@ -7677,11 +7437,7 @@
         <w:t>Consent-Logs:</w:t>
       </w:r>
       <w:r>
-        <w:t xml:space="preserve"> Nachweis protokollieren (Zeitpunkt, eingewilligte Zwecke, Textversion,</w:t>
-        <w:br/>
-      </w:r>
-      <w:r>
-        <w:t>technischer Nachweis).</w:t>
+        <w:t xml:space="preserve"> Nachweis protokollieren (Zeitpunkt, eingewilligte Zwecke, Textversion, technischer Nachweis).</w:t>
       </w:r>
       <w:r/>
       <w:r/>
@@ -7713,11 +7469,7 @@
         <w:t>Offene Frage (hoch):</w:t>
       </w:r>
       <w:r>
-        <w:t xml:space="preserve"> Ein Live-Abruf der Website war in der Arbeitsumgebung netzwerkseitig</w:t>
-        <w:br/>
-      </w:r>
-      <w:r>
-        <w:t xml:space="preserve">gesperrt. Folgende Punkte sind </w:t>
+        <w:t xml:space="preserve"> Ein Live-Abruf der Website war in der Arbeitsumgebung netzwerkseitig gesperrt. Folgende Punkte sind </w:t>
       </w:r>
       <w:r>
         <w:rPr>
@@ -7736,11 +7488,7 @@
         <w:t>Annahme:</w:t>
       </w:r>
       <w:r>
-        <w:t xml:space="preserve"> und per Live-Audit zu</w:t>
-        <w:br/>
-      </w:r>
-      <w:r>
-        <w:t>bestätigen (F-01).</w:t>
+        <w:t xml:space="preserve"> und per Live-Audit zu bestätigen (F-01).</w:t>
       </w:r>
       <w:r/>
       <w:r/>
@@ -7763,11 +7511,7 @@
         <w:t>anfrage_gesendet</w:t>
       </w:r>
       <w:r>
-        <w:t>); Domain als GSC-Property</w:t>
-        <w:br/>
-      </w:r>
-      <w:r>
-        <w:t>registriert; Website-Kontaktformular vorhanden.</w:t>
+        <w:t>); Domain als GSC-Property registriert; Website-Kontaktformular vorhanden.</w:t>
       </w:r>
       <w:r/>
     </w:p>
@@ -7805,11 +7549,7 @@
         <w:t>nach Opt-in</w:t>
       </w:r>
       <w:r>
-        <w:t>? IP-Anonymisierung/Retention konfiguriert?</w:t>
-        <w:br/>
-      </w:r>
-      <w:r>
-        <w:t xml:space="preserve">Google-Signals ohne Einwilligung deaktiviert? — </w:t>
+        <w:t xml:space="preserve">? IP-Anonymisierung/Retention konfiguriert? Google-Signals ohne Einwilligung deaktiviert? — </w:t>
       </w:r>
       <w:r>
         <w:rPr>
@@ -7869,10 +7609,20 @@
         <w:t>lokal gehostet</w:t>
       </w:r>
       <w:r>
-        <w:t xml:space="preserve"> (nicht dynamisch nachladen — vgl. LG München 2022)? —</w:t>
-        <w:br/>
-      </w:r>
-      <w:r/>
+        <w:t xml:space="preserve"> (nicht dynamisch nachladen — vgl. LG München 2022</w:t>
+      </w:r>
+      <w:hyperlink r:id="rId30">
+        <w:r>
+          <w:rPr>
+            <w:color w:val="0000EE"/>
+            <w:u w:val="single"/>
+          </w:rPr>
+          <w:t>2</w:t>
+        </w:r>
+      </w:hyperlink>
+      <w:r>
+        <w:t>)? —</w:t>
+      </w:r>
       <w:r>
         <w:rPr>
           <w:b/>
@@ -8031,9 +7781,7 @@
       </w:r>
       <w:r>
         <w:t xml:space="preserve"> vollständiges Inventar (Name, Zweck, Laufzeit, Anbieter)? —</w:t>
-        <w:br/>
-      </w:r>
-      <w:r/>
+      </w:r>
       <w:r>
         <w:rPr>
           <w:b/>
@@ -8063,7 +7811,6 @@
           <w:b/>
         </w:rPr>
         <w:t>Annahme:</w:t>
-        <w:br/>
       </w:r>
       <w:r>
         <w:t>fehlt/unzureichend.</w:t>
@@ -8080,15 +7827,7 @@
         <w:t>Empfehlungen:</w:t>
       </w:r>
       <w:r>
-        <w:t xml:space="preserve"> Consent-Management einführen und GA4 daran koppeln (oder auf Matomo mit</w:t>
-        <w:br/>
-      </w:r>
-      <w:r>
-        <w:t>Datenhoheit umstellen); Google Fonts lokal einbinden; Cookies inventarisieren; DSE an tatsächlich</w:t>
-        <w:br/>
-      </w:r>
-      <w:r>
-        <w:t>geladene Dienste anpassen; TLS/HSTS erzwingen.</w:t>
+        <w:t xml:space="preserve"> Consent-Management einführen und GA4 daran koppeln (oder auf Matomo mit Datenhoheit umstellen); Google Fonts lokal einbinden; Cookies inventarisieren; DSE an tatsächlich geladene Dienste anpassen; TLS/HSTS erzwingen.</w:t>
       </w:r>
       <w:r/>
     </w:p>
@@ -8118,11 +7857,7 @@
         <w:t>Schulung:</w:t>
       </w:r>
       <w:r>
-        <w:t xml:space="preserve"> Inhalte (DSGVO-Grundlagen, E-Mail-/Passwortverhalten, Phishing, Umgang mit Daten,</w:t>
-        <w:br/>
-      </w:r>
-      <w:r>
-        <w:t xml:space="preserve">Datenpannen-Meldung, Clean-Desk); Frequenz (Eintritt + </w:t>
+        <w:t xml:space="preserve"> Inhalte (DSGVO-Grundlagen, E-Mail-/Passwortverhalten, Phishing, Umgang mit Daten, Datenpannen-Meldung, Clean-Desk); Frequenz (Eintritt + </w:t>
       </w:r>
       <w:r>
         <w:rPr>
@@ -8131,11 +7866,7 @@
         <w:t>jährlich</w:t>
       </w:r>
       <w:r>
-        <w:t>); Nachweis</w:t>
-        <w:br/>
-      </w:r>
-      <w:r>
-        <w:t>(Teilnahmeliste/Signatur, Datum, Inhalt).</w:t>
+        <w:t>); Nachweis (Teilnahmeliste/Signatur, Datum, Inhalt).</w:t>
       </w:r>
       <w:r/>
     </w:p>
@@ -9335,15 +9066,7 @@
         <w:t>Zeitliche Zuordnung:</w:t>
       </w:r>
       <w:r>
-        <w:t xml:space="preserve"> Kurzfristig (0–3 Mon.): R1, R4, R7, R11, R2/R3 (Start) · Mittelfristig</w:t>
-        <w:br/>
-      </w:r>
-      <w:r>
-        <w:t>(3–12 Mon.): R2/R3 (Abschluss), R5, R6, R8, R10, R12 · Langfristig (&gt;12 Mon.): R9, kontinuierliche</w:t>
-        <w:br/>
-      </w:r>
-      <w:r>
-        <w:t>Verbesserung, Audits.</w:t>
+        <w:t xml:space="preserve"> Kurzfristig (0–3 Mon.): R1, R4, R7, R11, R2/R3 (Start) · Mittelfristig (3–12 Mon.): R2/R3 (Abschluss), R5, R6, R8, R10, R12 · Langfristig (&gt;12 Mon.): R9, kontinuierliche Verbesserung, Audits.</w:t>
       </w:r>
       <w:r/>
     </w:p>
@@ -9415,11 +9138,7 @@
         <w:t>KPIs:</w:t>
       </w:r>
       <w:r>
-        <w:t xml:space="preserve"> % abgeschlossene AVV; offene Betroffenenanfragen/Fristtreue; Zeit bis Datenpannen-</w:t>
-        <w:br/>
-      </w:r>
-      <w:r>
-        <w:t>Meldung; Schulungsquote; Anzahl offener Hoch-Risiken.</w:t>
+        <w:t xml:space="preserve"> % abgeschlossene AVV; offene Betroffenenanfragen/Fristtreue; Zeit bis Datenpannen- Meldung; Schulungsquote; Anzahl offener Hoch-Risiken.</w:t>
       </w:r>
       <w:r/>
     </w:p>
@@ -9468,19 +9187,7 @@
         <w:t>Meta-Fragen:</w:t>
       </w:r>
       <w:r>
-        <w:t xml:space="preserve"> Thema: DSGVO-Status/Maßnahmenplan fraesdienst-feind.de; Blickwinkel: interne</w:t>
-        <w:br/>
-      </w:r>
-      <w:r>
-        <w:t>Bestandsaufnahme + Handlungsplan; Zielgruppe: GF/DSB/IT/Behörde; Umfang: ausführlich; Format:</w:t>
-        <w:br/>
-      </w:r>
-      <w:r>
-        <w:t>gegliederter Bericht + Vorlagen; Ton: sachlich, praxisnah; Quellen: interne Codebasis + geltendes</w:t>
-        <w:br/>
-      </w:r>
-      <w:r>
-        <w:t>Recht (DSGVO/BDSG/TDDDG) + Branchenpraxis.</w:t>
+        <w:t xml:space="preserve"> Thema: DSGVO-Status/Maßnahmenplan fraesdienst-feind.de; Blickwinkel: interne Bestandsaufnahme + Handlungsplan; Zielgruppe: GF/DSB/IT/Behörde; Umfang: ausführlich; Format: gegliederter Bericht + Vorlagen; Ton: sachlich, praxisnah; Quellen: interne Codebasis + geltendes Recht (DSGVO/BDSG/TDDDG) + Branchenpraxis.</w:t>
       </w:r>
       <w:r/>
     </w:p>
@@ -11369,7 +11076,6 @@
         <w:t>8;Lieferantenverwaltung;Beschaffung;Art.6 I b/f;Lieferanten;Kontakt-,Vertrags-,Zahlungsdaten;Bank;EU;3 J. nach Vertragsende;Zugriffsschutz;Einkauf/Buchhaltung</w:t>
         <w:br/>
         <w:t>9;IT-Sicherheit/Server-Logs;Betriebssicherheit;Art.6 I f;Website-Besucher;IP,Zeitstempel;{{HOSTING_PROVIDER}};{{HOST_DRITTLAND}};7-30 Tage;Zugriffsschutz,Loeschautomatik;IT</w:t>
-        <w:br/>
       </w:r>
       <w:r/>
     </w:p>
@@ -11440,7 +11146,6 @@
         <w:t>BEISPIEL 3 - Fernwartung: Risiko mittel-hoch; Massnahmen: AVV, Zugriff nur nach Freigabe,</w:t>
         <w:br/>
         <w:t>Protokollierung, Verschluesselung; Restrisiko akzeptabel.</w:t>
-        <w:br/>
       </w:r>
       <w:r/>
     </w:p>
@@ -11530,7 +11235,6 @@
         <w:t>Uebermittlung in Drittlaender nur auf zulaessiger Grundlage (Angemessenheitsbeschluss/DPF bzw.</w:t>
         <w:br/>
         <w:t>Standardvertragsklauseln, Art. 44 ff.).</w:t>
-        <w:br/>
       </w:r>
       <w:r/>
     </w:p>
@@ -11586,7 +11290,6 @@
         <w:t>fuer die Zukunft widerrufen (Abmeldelink in jeder E-Mail oder E-Mail an {{KONTAKT_EMAIL}}).</w:t>
         <w:br/>
         <w:t>Hinweise zur Verarbeitung: siehe Datenschutzerklaerung unter {{DSE_URL}}.</w:t>
-        <w:br/>
       </w:r>
       <w:r/>
     </w:p>
@@ -11613,7 +11316,6 @@
         <w:t>Sie koennen frei entscheiden und Ihre Auswahl jederzeit unter "Einstellungen" widerrufen.</w:t>
         <w:br/>
         <w:t>[Alle akzeptieren] [Nur notwendige] [Einstellungen]</w:t>
-        <w:br/>
       </w:r>
       <w:r/>
     </w:p>
@@ -11638,7 +11340,6 @@
         <w:t>(Website, Social Media, Print) durch {{COMPANY_NAME}} verwendet werden duerfen. Die Einwilligung</w:t>
         <w:br/>
         <w:t>ist freiwillig und jederzeit fuer die Zukunft widerrufbar (Kontakt: {{KONTAKT_EMAIL}}).</w:t>
-        <w:br/>
       </w:r>
       <w:r/>
     </w:p>
@@ -11731,7 +11432,6 @@
         <w:br/>
         <w:br/>
         <w:t>10. Stand: {{DATUM}}</w:t>
-        <w:br/>
       </w:r>
       <w:r/>
     </w:p>
@@ -11787,7 +11487,6 @@
         <w:t>6. Wurde &gt;72h ueberschritten? Begruendung: ...</w:t>
         <w:br/>
         <w:t>Ort, Datum, Unterschrift</w:t>
-        <w:br/>
       </w:r>
       <w:r/>
     </w:p>
@@ -11816,7 +11515,6 @@
         <w:t>Moegliche Folgen: ... Wir haben folgende Massnahmen ergriffen: ...</w:t>
         <w:br/>
         <w:t>Empfehlung an Sie: [z. B. Passwort aendern]. Bei Rueckfragen: {{DPO_CONTACT}} / {{KONTAKT_EMAIL}}.</w:t>
-        <w:br/>
       </w:r>
       <w:r/>
     </w:p>
@@ -11860,7 +11558,6 @@
         <w:t>Sofortmassnahmen: ...   Ursachenanalyse: ...   Folgemassnahmen/TOM-Anpassung: ...</w:t>
         <w:br/>
         <w:t>Abschluss/Freigabe (GF/DSB), Datum: ...</w:t>
-        <w:br/>
       </w:r>
       <w:r/>
     </w:p>
@@ -11908,7 +11605,6 @@
         <w:t>Widerspruch sowie Beschwerde bei der Aufsichtsbehoerde. Fuer Rueckfragen: {{KONTAKT_EMAIL}}.</w:t>
         <w:br/>
         <w:t>Mit freundlichen Gruessen, {{COMPANY_NAME}}</w:t>
-        <w:br/>
       </w:r>
       <w:r/>
     </w:p>
@@ -11935,7 +11631,6 @@
         <w:t>soweit keine gesetzlichen Aufbewahrungspflichten (z. B. steuerrechtlich) entgegenstehen. In diesem</w:t>
         <w:br/>
         <w:t>Fall erfolgt die Loeschung nach Fristablauf. Mit freundlichen Gruessen, {{COMPANY_NAME}}</w:t>
-        <w:br/>
       </w:r>
       <w:r/>
     </w:p>
@@ -11975,7 +11670,6 @@
         <w:t>[ ] Audit-/Nachweisrechte vereinbart</w:t>
         <w:br/>
         <w:t>[ ] Loesch-/Rueckgaberegelung enthalten</w:t>
-        <w:br/>
       </w:r>
       <w:r/>
     </w:p>
@@ -12021,7 +11715,6 @@
         <w:t>[ ] Physische Sicherung (Serverraum/Akten)</w:t>
         <w:br/>
         <w:t>[ ] Notfall-/Wiederanlaufplan</w:t>
-        <w:br/>
       </w:r>
       <w:r/>
     </w:p>
@@ -12992,7 +12685,6 @@
         <w:t>[ ] Impressum vollstaendig (§ 5 DDG)</w:t>
         <w:br/>
         <w:t>[ ] Kontaktformular: Datensparsamkeit + Datenschutzhinweis + TLS</w:t>
-        <w:br/>
       </w:r>
       <w:r/>
     </w:p>
@@ -14485,7 +14177,6 @@
         <w:t xml:space="preserve">   (Verantwortlich: GF/DSB; Frist: 8-12 Wochen)</w:t>
         <w:br/>
         <w:t>Rechtlicher Hinweis: Muster vor Einsatz durch Rechtsabteilung/Fachanwalt pruefen lassen.</w:t>
-        <w:br/>
       </w:r>
       <w:r/>
     </w:p>
@@ -14524,11 +14215,7 @@
         <w:t>.env</w:t>
       </w:r>
       <w:r>
-        <w:t>/Config,</w:t>
-        <w:br/>
-      </w:r>
-      <w:r>
-        <w:t>dann Bericht neu generieren.</w:t>
+        <w:t>/Config, dann Bericht neu generieren.</w:t>
       </w:r>
       <w:r/>
     </w:p>
@@ -14549,11 +14236,7 @@
         <w:t>Fakten</w:t>
       </w:r>
       <w:r>
-        <w:t xml:space="preserve"> überführen</w:t>
-        <w:br/>
-      </w:r>
-      <w:r>
-        <w:t xml:space="preserve">(Präfix </w:t>
+        <w:t xml:space="preserve"> überführen (Präfix </w:t>
       </w:r>
       <w:r>
         <w:rPr>
@@ -15439,9 +15122,7 @@
       </w:r>
       <w:r>
         <w:t xml:space="preserve"> zusammengefasst.</w:t>
-        <w:br/>
-      </w:r>
-      <w:r/>
+      </w:r>
       <w:r>
         <w:rPr>
           <w:b/>
@@ -15465,7 +15146,6 @@
           <w:b/>
         </w:rPr>
         <w:t>Kap. 17</w:t>
-        <w:br/>
       </w:r>
       <w:r>
         <w:t>priorisiert (4-spaltig).</w:t>
@@ -15500,9 +15180,7 @@
       </w:r>
       <w:r>
         <w:t>,</w:t>
-        <w:br/>
-      </w:r>
-      <w:r/>
+      </w:r>
       <w:r>
         <w:rPr>
           <w:rFonts w:ascii="Courier" w:hAnsi="Courier"/>
@@ -15528,19 +15206,7 @@
         <w:t>data/crm/leads.example.csv</w:t>
       </w:r>
       <w:r>
-        <w:t>) als verifizierte Faktenbasis;</w:t>
-        <w:br/>
-      </w:r>
-      <w:r>
-        <w:t>(2) geltendes Recht: DSGVO, BDSG, TDDDG (vormals TTDSG), ePrivacy-Richtlinie, AO/HGB;</w:t>
-        <w:br/>
-      </w:r>
-      <w:r>
-        <w:t>(3) EU-US Data Privacy Framework (Angemessenheitsbeschluss 10.07.2023); (4) allgemeine</w:t>
-        <w:br/>
-      </w:r>
-      <w:r>
-        <w:t xml:space="preserve">KMU-/Branchenpraxis. Es wurde </w:t>
+        <w:t xml:space="preserve">) als verifizierte Faktenbasis; (2) geltendes Recht: DSGVO, BDSG, TDDDG (vormals TTDSG), ePrivacy-Richtlinie, AO/HGB; (3) EU-US Data Privacy Framework (Angemessenheitsbeschluss 10.07.2023); (4) allgemeine KMU-/Branchenpraxis. Es wurde </w:t>
       </w:r>
       <w:r>
         <w:rPr>
@@ -15571,11 +15237,7 @@
         <w:t>.env</w:t>
       </w:r>
       <w:r>
-        <w:t>/Config) kann der</w:t>
-        <w:br/>
-      </w:r>
-      <w:r>
-        <w:t>Bericht automatisiert neu erzeugt und Annahmen in Fakten überführt werden.</w:t>
+        <w:t>/Config) kann der Bericht automatisiert neu erzeugt und Annahmen in Fakten überführt werden.</w:t>
       </w:r>
       <w:r/>
     </w:p>
@@ -15593,15 +15255,98 @@
         <w:rPr>
           <w:i/>
         </w:rPr>
-        <w:t>Ende des Berichts — Version 1.1 (Entwurf), 14.09.2026. Streng vertraulich. Vor rechtsverbindlichem</w:t>
-        <w:br/>
-      </w:r>
-      <w:r>
-        <w:rPr>
-          <w:i/>
-        </w:rPr>
-        <w:t>Einsatz der Vorlagen: Prüfung durch Rechtsabteilung / Fachanwalt für IT-Recht.</w:t>
-      </w:r>
+        <w:t>Ende des Berichts — Version 1.2 (Entwurf), 14.09.2026. Streng vertraulich. Vor rechtsverbindlichem Einsatz der Vorlagen: Prüfung durch Rechtsabteilung / Fachanwalt für IT-Recht.</w:t>
+      </w:r>
+      <w:r/>
+      <w:r/>
+    </w:p>
+    <w:p>
+      <w:pPr>
+        <w:pBdr>
+          <w:bottom w:val="single" w:sz="6" w:space="1" w:color="auto"/>
+        </w:pBdr>
+      </w:pPr>
+      <w:r/>
+      <w:r/>
+    </w:p>
+    <w:p>
+      <w:pPr>
+        <w:pStyle w:val="ListNumber"/>
+        <w:spacing w:line="240" w:lineRule="auto"/>
+        <w:ind w:left="720"/>
+      </w:pPr>
+      <w:r/>
+      <w:r/>
+    </w:p>
+    <w:p>
+      <w:r/>
+      <w:r>
+        <w:t xml:space="preserve">EU-US Data Privacy Framework — Angemessenheitsbeschluss der EU-Kommission vom 10.07.2023; nach Art. 45 DSGVO gelten zertifizierte US-Unternehmen (u. a. Google LLC) als sicheres Drittland. SCC (Art. 46) als Auffanglösung. </w:t>
+      </w:r>
+      <w:hyperlink r:id="rId31">
+        <w:r>
+          <w:rPr>
+            <w:color w:val="0000EE"/>
+            <w:u w:val="single"/>
+          </w:rPr>
+          <w:t>↩</w:t>
+        </w:r>
+      </w:hyperlink>
+      <w:r/>
+      <w:r/>
+    </w:p>
+    <w:p>
+      <w:pPr>
+        <w:pStyle w:val="ListNumber"/>
+        <w:spacing w:line="240" w:lineRule="auto"/>
+        <w:ind w:left="720"/>
+      </w:pPr>
+      <w:r/>
+      <w:r/>
+    </w:p>
+    <w:p>
+      <w:r/>
+      <w:r>
+        <w:t xml:space="preserve">LG München I, Urteil vom 20.01.2022 (Az. 3 O 17493/20): das dynamische Nachladen von Google Fonts von Google-Servern ohne Einwilligung verletzt das allgemeine Persönlichkeitsrecht (IP-Übermittlung). Empfehlung: Schriften lokal einbinden. </w:t>
+      </w:r>
+      <w:hyperlink r:id="rId32">
+        <w:r>
+          <w:rPr>
+            <w:color w:val="0000EE"/>
+            <w:u w:val="single"/>
+          </w:rPr>
+          <w:t>↩</w:t>
+        </w:r>
+      </w:hyperlink>
+      <w:r/>
+      <w:r/>
+    </w:p>
+    <w:p>
+      <w:pPr>
+        <w:pStyle w:val="ListNumber"/>
+        <w:spacing w:line="240" w:lineRule="auto"/>
+        <w:ind w:left="720"/>
+      </w:pPr>
+      <w:r/>
+      <w:r/>
+    </w:p>
+    <w:p>
+      <w:r/>
+      <w:r>
+        <w:t xml:space="preserve">§ 25 TDDDG (Telekommunikation-Digitale-Dienste-Datenschutz-Gesetz, in Kraft seit 14.05.2024; zuvor § 25 TTDSG) verlangt eine Einwilligung für das Speichern/Auslesen von Informationen auf Endgeräten (Cookies, Tracking), sofern nicht unbedingt erforderlich. </w:t>
+      </w:r>
+      <w:hyperlink r:id="rId33">
+        <w:r>
+          <w:rPr>
+            <w:color w:val="0000EE"/>
+            <w:u w:val="single"/>
+          </w:rPr>
+          <w:t>↩</w:t>
+        </w:r>
+      </w:hyperlink>
+      <w:r/>
+      <w:r/>
+      <w:r/>
     </w:p>
     <w:sectPr>
       <w:pgSz w:w="12240" w:h="15840"/>

</xml_diff>

<commit_message>
docs(datenschutz): Bericht v1.3 + .env-Vorlage (.env.example)
- Neue .env-Vorlage `.env.example` im Repository-Wurzelverzeichnis:
  alle vom seo_reporting-Dienst gelesenen ENV-Variablen (GSC_SITE_URL,
  GA4_PROPERTY_ID, GOOGLE_APPLICATION_CREDENTIALS/…_JSON, CRM_EXPORT_PATH,
  REPORT_OUTPUT_DIR, SMTP_*, REPORT_EMAIL_*, SEO_REPORTING_CONFIG) sowie
  die Berichtsvariablen des Datenschutzberichts (Abschnitt 0 / Anhang R).
  Echte `.env` bleibt per .gitignore ausgeschlossen; nur die Vorlage ist versioniert.
- Datenschutzbericht auf v1.3 (17.09.2026) in allen Formaten (md/html/pdf/docx):
  Änderungsvermerk v1.3, Faktenlage-Hinweis + Abschnitt 0 + Anhang R verweisen
  jetzt auf `.env.example`. PDF neu aus HTML gerendert (15 Seiten), DOCX aktualisiert.
- docs/SETUP.md: Hinweis auf `.env.example` und cp-Workflow ergänzt.

Co-Authored-By: Claude Opus 4.8 <noreply@anthropic.com>
Claude-Session: https://claude.ai/code/session_016r2jkq6ZcoXzzzAHt5Zrx5
</commit_message>
<xml_diff>
--- a/docs/datenschutz/datenschutzbericht.docx
+++ b/docs/datenschutz/datenschutzbericht.docx
@@ -56,7 +56,7 @@
         <w:t>Berichtsdatum:</w:t>
       </w:r>
       <w:r>
-        <w:t xml:space="preserve"> 14.09.2026</w:t>
+        <w:t xml:space="preserve"> 17.09.2026</w:t>
       </w:r>
       <w:r>
         <w:rPr>
@@ -65,7 +65,16 @@
         <w:t>Version:</w:t>
       </w:r>
       <w:r>
-        <w:t xml:space="preserve"> 1.2 (Entwurf)</w:t>
+        <w:t xml:space="preserve"> 1.3 (Entwurf)</w:t>
+      </w:r>
+      <w:r>
+        <w:rPr>
+          <w:b/>
+        </w:rPr>
+        <w:t>Änderungsvermerk v1.3:</w:t>
+      </w:r>
+      <w:r>
+        <w:t xml:space="preserve"> Mitgelieferte .env-Vorlage (.env.example im Repository-Wurzelverzeichnis): Alle im Bericht referenzierten Umgebungsvariablen (Abschnitt 0, Anhang R) sind dort als ausfüllbare Vorlage hinterlegt. Abschnitt 0 und der Faktenlage-Hinweis verweisen jetzt auf diese Datei; das Platzhalter-Verzeichnis (Anhang R) nennt die zugehörigen .env-Schlüssel.</w:t>
       </w:r>
       <w:r>
         <w:rPr>
@@ -356,6 +365,12 @@
         <w:t>).</w:t>
       </w:r>
       <w:r/>
+    </w:p>
+    <w:p>
+      <w:pPr/>
+      <w:r>
+        <w:t>Seit v1.3 liegt im Repository-Wurzelverzeichnis eine .env-Vorlage (.env.example) bereit, in der alle hier genannten Variablen aufgeführt sind. Sobald David/IT diese Vorlage nach .env kopiert und mit echten Werten füllt (cp .env.example .env), lassen sich die Annahmen in Fakten überführen und der Bericht kann darauf gestützt aktualisiert werden (Anhang Q).</w:t>
+      </w:r>
     </w:p>
     <w:p>
       <w:r/>
@@ -872,6 +887,12 @@
         <w:t xml:space="preserve"> und den jeweils gesetzten Platzhalter/Annahmestatus.</w:t>
       </w:r>
       <w:r/>
+    </w:p>
+    <w:p>
+      <w:pPr/>
+      <w:r>
+        <w:t>.env-Vorlage (seit v1.3): Die Datei .env.example im Repository-Wurzelverzeichnis enthält alle unten aufgeführten Variablen als leere, kommentierte Vorlage. Zum Befüllen: cp .env.example .env und echte Werte eintragen. Die echte .env ist per .gitignore ausgeschlossen und wird nie committet (nur die Vorlage .env.example ist versioniert).</w:t>
+      </w:r>
     </w:p>
     <w:tbl>
       <w:tblPr>
@@ -14327,6 +14348,12 @@
       </w:r>
       <w:r/>
     </w:p>
+    <w:p>
+      <w:pPr/>
+      <w:r>
+        <w:t>Die Spalte „Quelle" nennt den zugehörigen Schlüssel in der .env-Vorlage (.env.example, Repository-Wurzel) bzw. „manuell", wenn der Wert direkt einzutragen ist.</w:t>
+      </w:r>
+    </w:p>
     <w:tbl>
       <w:tblPr>
         <w:tblStyle w:val="LightGrid-Accent1"/>
@@ -15255,7 +15282,7 @@
         <w:rPr>
           <w:i/>
         </w:rPr>
-        <w:t>Ende des Berichts — Version 1.2 (Entwurf), 14.09.2026. Streng vertraulich. Vor rechtsverbindlichem Einsatz der Vorlagen: Prüfung durch Rechtsabteilung / Fachanwalt für IT-Recht.</w:t>
+        <w:t>Ende des Berichts — Version 1.3 (Entwurf), 17.09.2026. Streng vertraulich. Vor rechtsverbindlichem Einsatz der Vorlagen: Prüfung durch Rechtsabteilung / Fachanwalt für IT-Recht.</w:t>
       </w:r>
       <w:r/>
       <w:r/>

</xml_diff>

<commit_message>
docs(datenschutz): Bericht v1.3 — Unternehmensprofil und Aufsichtsbehörde korrigiert
- Geschäftsfelder: Kaltfräsen von Asphalt/Beton, Grinding & Grooving, Pflasterschleifen,
  Rundum-Service statt CNC-Fräsen/Lohnfertigung/Werkstoffe (falsche Branche aus Platzhaltern)
- Standorte Lübben (Brandenburg) und Wittenburg (MV); Aufsichtsbehörde LDA Brandenburg
  statt LDI NRW (alle Stellen inkl. Meldeweg, Betroffenenrechte, Annahmen-Tabelle)
- Datenkategorien/Empfänger ans Baugeschäft angepasst: Ausschreibungs-/Planunterlagen statt
  CAD, Bauleitung/Disposition statt Fertigung, Subunternehmer/Entsorger statt Versand;
  Telematikdaten der Maschinen als offene Frage ergänzt
- MD, HTML und DOCX textgleich korrigiert; PDF aus dem HTML neu erzeugt

Co-Authored-By: Claude Fable 5.1 <noreply@anthropic.com>
Claude-Session: https://claude.ai/code/session_01NxGXwh8Hg754ZszAk9yi7E
</commit_message>
<xml_diff>
--- a/docs/datenschutz/datenschutzbericht.docx
+++ b/docs/datenschutz/datenschutzbericht.docx
@@ -17,127 +17,127 @@
         <w:rPr>
           <w:b/>
         </w:rPr>
-        <w:t>Domain:</w:t>
-      </w:r>
-      <w:r>
-        <w:t xml:space="preserve"> fraesdienst-feind.de</w:t>
+        <w:t xml:space="preserve">Domain: fraesdienst-feind.deBerichtstyp: Zusammenfassender Datenschutz-/DSGVO-Statusbericht mit Maßnahmen, Vorlagen und RoadmapZielgruppe: Geschäftsführung, Datenschutzbeauftragte® (intern/extern), IT-Verantwortliche, ggf. Aufsichtsbehörde (LDA Brandenburg)Erstellt von: David Halko (Marketing &amp; Eventmanagement) mit KI-UnterstützungBerichtsdatum: 14.09.2026Version: 1.3 (Entwurf) · Änderungsvermerk v1.3 (21.09.2026): Unternehmensprofil korrigiert (Kaltfräsarbeiten im Straßen-/Tiefbau statt CNC-Fertigung), Standorte Lübben (Brandenburg) und Wittenburg (Mecklenburg-Vorpommern) sowie zuständige Aufsichtsbehörde (LDA Brandenburg statt LDI NRW), Datenkategorien und Empfänger an das Baugeschäft angepasst.Änderungsvermerk v1.2: Aufgewertete Ausgabe (klickbares Inhaltsverzeichnis mit Anker-Links, verbesserte Tabellen-Darstellung, Fußnoten zu Rechtsquellen) sowie zusätzliche browserfreundliche HTML-Ansicht mit Navigations-Seitenleiste.Änderungsvermerk v1.1: Durchgängige Annahme:/Offene Frage:-Kennzeichnung, {{PLATZHALTER}}-Mechanismus in allen Vorlagen, neuer Abschnitt zur .env-Ableitungslogik, 4-spaltige Offene-Fragen-Tabelle, ergänzte kostengünstige/Open-Source-Optionen.Vertraulichkeit: Streng vertraulich — nur zur internen Verwendung</w:t>
+      </w:r>
+      <w:r>
+        <w:t xml:space="preserve"/>
       </w:r>
       <w:r>
         <w:rPr>
           <w:b/>
         </w:rPr>
-        <w:t>Berichtstyp:</w:t>
-      </w:r>
-      <w:r>
-        <w:t xml:space="preserve"> Zusammenfassender Datenschutz-/DSGVO-Statusbericht mit Maßnahmen, Vorlagen und Roadmap</w:t>
+        <w:t xml:space="preserve"/>
+      </w:r>
+      <w:r>
+        <w:t xml:space="preserve"/>
       </w:r>
       <w:r>
         <w:rPr>
           <w:b/>
         </w:rPr>
-        <w:t>Zielgruppe:</w:t>
-      </w:r>
-      <w:r>
-        <w:t xml:space="preserve"> Geschäftsführung, Datenschutzbeauftragte® (intern/extern), IT-Verantwortliche, ggf. Aufsichtsbehörde (LDI NRW)</w:t>
+        <w:t xml:space="preserve"/>
+      </w:r>
+      <w:r>
+        <w:t xml:space="preserve"/>
       </w:r>
       <w:r>
         <w:rPr>
           <w:b/>
         </w:rPr>
-        <w:t>Erstellt von:</w:t>
-      </w:r>
-      <w:r>
-        <w:t xml:space="preserve"> David Halko (Marketing &amp; Eventmanagement) mit KI-Unterstützung</w:t>
+        <w:t xml:space="preserve"/>
+      </w:r>
+      <w:r>
+        <w:t xml:space="preserve"/>
       </w:r>
       <w:r>
         <w:rPr>
           <w:b/>
         </w:rPr>
-        <w:t>Berichtsdatum:</w:t>
-      </w:r>
-      <w:r>
-        <w:t xml:space="preserve"> 14.09.2026</w:t>
+        <w:t xml:space="preserve"/>
+      </w:r>
+      <w:r>
+        <w:t xml:space="preserve"/>
       </w:r>
       <w:r>
         <w:rPr>
           <w:b/>
         </w:rPr>
-        <w:t>Version:</w:t>
-      </w:r>
-      <w:r>
-        <w:t xml:space="preserve"> 1.2 (Entwurf)</w:t>
+        <w:t xml:space="preserve"/>
+      </w:r>
+      <w:r>
+        <w:t xml:space="preserve"/>
       </w:r>
       <w:r>
         <w:rPr>
           <w:b/>
         </w:rPr>
-        <w:t>Änderungsvermerk v1.2:</w:t>
-      </w:r>
-      <w:r>
-        <w:t xml:space="preserve"> Aufgewertete Ausgabe (klickbares Inhaltsverzeichnis mit Anker-Links, verbesserte Tabellen-Darstellung, </w:t>
+        <w:t xml:space="preserve"/>
+      </w:r>
+      <w:r>
+        <w:t xml:space="preserve"/>
       </w:r>
       <w:r>
         <w:rPr>
           <w:b/>
         </w:rPr>
-        <w:t>Fußnoten</w:t>
-      </w:r>
-      <w:r>
-        <w:t xml:space="preserve"> zu Rechtsquellen) sowie zusätzliche browserfreundliche HTML-Ansicht mit Navigations-Seitenleiste.</w:t>
+        <w:t xml:space="preserve"/>
+      </w:r>
+      <w:r>
+        <w:t xml:space="preserve"/>
       </w:r>
       <w:r>
         <w:rPr>
           <w:b/>
         </w:rPr>
-        <w:t>Änderungsvermerk v1.1:</w:t>
-      </w:r>
-      <w:r>
-        <w:t xml:space="preserve"> Durchgängige </w:t>
+        <w:t xml:space="preserve"/>
+      </w:r>
+      <w:r>
+        <w:t xml:space="preserve"/>
       </w:r>
       <w:r>
         <w:rPr>
           <w:rFonts w:ascii="Courier" w:hAnsi="Courier"/>
         </w:rPr>
-        <w:t>Annahme:</w:t>
-      </w:r>
-      <w:r>
-        <w:t>/</w:t>
+        <w:t xml:space="preserve"/>
+      </w:r>
+      <w:r>
+        <w:t xml:space="preserve"/>
       </w:r>
       <w:r>
         <w:rPr>
           <w:rFonts w:ascii="Courier" w:hAnsi="Courier"/>
         </w:rPr>
-        <w:t>Offene Frage:</w:t>
-      </w:r>
-      <w:r>
-        <w:t xml:space="preserve">-Kennzeichnung, </w:t>
+        <w:t xml:space="preserve"/>
+      </w:r>
+      <w:r>
+        <w:t xml:space="preserve"/>
       </w:r>
       <w:r>
         <w:rPr>
           <w:rFonts w:ascii="Courier" w:hAnsi="Courier"/>
         </w:rPr>
-        <w:t>{{PLATZHALTER}}</w:t>
-      </w:r>
-      <w:r>
-        <w:t xml:space="preserve">-Mechanismus in allen Vorlagen, neuer Abschnitt zur </w:t>
+        <w:t xml:space="preserve"/>
+      </w:r>
+      <w:r>
+        <w:t xml:space="preserve"/>
       </w:r>
       <w:r>
         <w:rPr>
           <w:rFonts w:ascii="Courier" w:hAnsi="Courier"/>
         </w:rPr>
-        <w:t>.env</w:t>
-      </w:r>
-      <w:r>
-        <w:t>-Ableitungslogik, 4-spaltige Offene-Fragen-Tabelle, ergänzte kostengünstige/Open-Source-Optionen.</w:t>
+        <w:t xml:space="preserve"/>
+      </w:r>
+      <w:r>
+        <w:t xml:space="preserve"/>
       </w:r>
       <w:r>
         <w:rPr>
           <w:b/>
         </w:rPr>
-        <w:t>Vertraulichkeit:</w:t>
-      </w:r>
-      <w:r>
-        <w:t xml:space="preserve"> Streng vertraulich — nur zur internen Verwendung</w:t>
+        <w:t xml:space="preserve"/>
+      </w:r>
+      <w:r>
+        <w:t xml:space="preserve"/>
       </w:r>
       <w:r/>
     </w:p>
@@ -184,176 +184,176 @@
         <w:rPr>
           <w:b/>
         </w:rPr>
-        <w:t xml:space="preserve">Hinweis zur Faktenlage &amp; zu </w:t>
+        <w:t xml:space="preserve">Hinweis zur Faktenlage &amp; zu .env-Werten: Dieser Bericht sollte laut Auftrag aus Umgebungsvariablen (.env: z. B. HOSTING_PROVIDER, CMS, THIRD_PARTY_SERVICES,INTEGRATIONS) gespeist werden. In der Arbeitsumgebung war jedoch keine .env, keineconfig.yaml und keine entsprechende Umgebungsvariable vorhanden (nur config.example.yaml). Die im Auftrag beispielhaft genannten Werte („Hetzner", „WordPress") sind daher Beispiele, keine bestätigten Daten. Alle aus diesen Variablen ableitbaren Angaben sind deshalb alsAnnahme: gekennzeichnet und über {{PLATZHALTER}} sowie den Fragenkatalog (Kap. 16/17) als offene Punkte geführt. Verifizierte Fakten zum Unternehmensprofil stammen von der Website fraesdienst-feind.de und dem Notion Marketing-Scan (09/2026); technische Fakten aus der internen SEO-/Lead-Reporting-Codebasis (config.example.yaml, docs/SPEC.md, docs/SETUP.md, data/crm/leads.example.csv).</w:t>
       </w:r>
       <w:r>
         <w:rPr>
           <w:rFonts w:ascii="Courier" w:hAnsi="Courier"/>
           <w:b/>
         </w:rPr>
-        <w:t>.env</w:t>
+        <w:t xml:space="preserve"/>
       </w:r>
       <w:r>
         <w:rPr>
           <w:b/>
         </w:rPr>
-        <w:t>-Werten:</w:t>
-      </w:r>
-      <w:r>
-        <w:t xml:space="preserve"> Dieser Bericht sollte laut Auftrag aus Umgebungsvariablen (</w:t>
+        <w:t xml:space="preserve"/>
+      </w:r>
+      <w:r>
+        <w:t xml:space="preserve"/>
       </w:r>
       <w:r>
         <w:rPr>
           <w:rFonts w:ascii="Courier" w:hAnsi="Courier"/>
         </w:rPr>
-        <w:t>.env</w:t>
-      </w:r>
-      <w:r>
-        <w:t xml:space="preserve">: z. B. </w:t>
+        <w:t xml:space="preserve"/>
+      </w:r>
+      <w:r>
+        <w:t xml:space="preserve"/>
       </w:r>
       <w:r>
         <w:rPr>
           <w:rFonts w:ascii="Courier" w:hAnsi="Courier"/>
         </w:rPr>
-        <w:t>HOSTING_PROVIDER</w:t>
-      </w:r>
-      <w:r>
-        <w:t xml:space="preserve">, </w:t>
+        <w:t xml:space="preserve"/>
+      </w:r>
+      <w:r>
+        <w:t xml:space="preserve"/>
       </w:r>
       <w:r>
         <w:rPr>
           <w:rFonts w:ascii="Courier" w:hAnsi="Courier"/>
         </w:rPr>
-        <w:t>CMS</w:t>
-      </w:r>
-      <w:r>
-        <w:t xml:space="preserve">, </w:t>
+        <w:t xml:space="preserve"/>
+      </w:r>
+      <w:r>
+        <w:t xml:space="preserve"/>
       </w:r>
       <w:r>
         <w:rPr>
           <w:rFonts w:ascii="Courier" w:hAnsi="Courier"/>
         </w:rPr>
-        <w:t>THIRD_PARTY_SERVICES</w:t>
-      </w:r>
-      <w:r>
-        <w:t>,</w:t>
+        <w:t xml:space="preserve"/>
+      </w:r>
+      <w:r>
+        <w:t xml:space="preserve"/>
       </w:r>
       <w:r>
         <w:rPr>
           <w:rFonts w:ascii="Courier" w:hAnsi="Courier"/>
         </w:rPr>
-        <w:t>INTEGRATIONS</w:t>
-      </w:r>
-      <w:r>
-        <w:t xml:space="preserve">) gespeist werden. </w:t>
+        <w:t xml:space="preserve"/>
+      </w:r>
+      <w:r>
+        <w:t xml:space="preserve"/>
       </w:r>
       <w:r>
         <w:rPr>
           <w:b/>
         </w:rPr>
-        <w:t xml:space="preserve">In der Arbeitsumgebung war jedoch keine </w:t>
+        <w:t xml:space="preserve"/>
       </w:r>
       <w:r>
         <w:rPr>
           <w:rFonts w:ascii="Courier" w:hAnsi="Courier"/>
           <w:b/>
         </w:rPr>
-        <w:t>.env</w:t>
+        <w:t xml:space="preserve"/>
       </w:r>
       <w:r>
         <w:rPr>
           <w:b/>
         </w:rPr>
-        <w:t>, keine</w:t>
+        <w:t xml:space="preserve"/>
       </w:r>
       <w:r>
         <w:rPr>
           <w:rFonts w:ascii="Courier" w:hAnsi="Courier"/>
           <w:b/>
         </w:rPr>
-        <w:t>config.yaml</w:t>
+        <w:t xml:space="preserve"/>
       </w:r>
       <w:r>
         <w:rPr>
           <w:b/>
         </w:rPr>
-        <w:t xml:space="preserve"> und keine entsprechende Umgebungsvariable vorhanden</w:t>
-      </w:r>
-      <w:r>
-        <w:t xml:space="preserve"> (nur </w:t>
+        <w:t xml:space="preserve"/>
+      </w:r>
+      <w:r>
+        <w:t xml:space="preserve"/>
       </w:r>
       <w:r>
         <w:rPr>
           <w:rFonts w:ascii="Courier" w:hAnsi="Courier"/>
         </w:rPr>
-        <w:t>config.example.yaml</w:t>
-      </w:r>
-      <w:r>
-        <w:t xml:space="preserve">). Die im Auftrag beispielhaft genannten Werte („Hetzner", „WordPress") sind daher </w:t>
+        <w:t xml:space="preserve"/>
+      </w:r>
+      <w:r>
+        <w:t xml:space="preserve"/>
       </w:r>
       <w:r>
         <w:rPr>
           <w:b/>
         </w:rPr>
-        <w:t>Beispiele, keine bestätigten Daten</w:t>
-      </w:r>
-      <w:r>
-        <w:t>. Alle aus diesen Variablen ableitbaren Angaben sind deshalb als</w:t>
+        <w:t xml:space="preserve"/>
+      </w:r>
+      <w:r>
+        <w:t xml:space="preserve"/>
       </w:r>
       <w:r>
         <w:rPr>
           <w:rFonts w:ascii="Courier" w:hAnsi="Courier"/>
           <w:b/>
         </w:rPr>
-        <w:t>Annahme:</w:t>
-      </w:r>
-      <w:r>
-        <w:t xml:space="preserve"> gekennzeichnet und über </w:t>
+        <w:t xml:space="preserve"/>
+      </w:r>
+      <w:r>
+        <w:t xml:space="preserve"/>
       </w:r>
       <w:r>
         <w:rPr>
           <w:rFonts w:ascii="Courier" w:hAnsi="Courier"/>
         </w:rPr>
-        <w:t>{{PLATZHALTER}}</w:t>
-      </w:r>
-      <w:r>
-        <w:t xml:space="preserve"> sowie den Fragenkatalog (Kap. 16/17) als offene Punkte geführt. Verifizierte Fakten stammen aus der internen SEO-/Lead-Reporting- Codebasis (</w:t>
+        <w:t xml:space="preserve"/>
+      </w:r>
+      <w:r>
+        <w:t xml:space="preserve"/>
       </w:r>
       <w:r>
         <w:rPr>
           <w:rFonts w:ascii="Courier" w:hAnsi="Courier"/>
         </w:rPr>
-        <w:t>config.example.yaml</w:t>
-      </w:r>
-      <w:r>
-        <w:t xml:space="preserve">, </w:t>
+        <w:t xml:space="preserve"/>
+      </w:r>
+      <w:r>
+        <w:t xml:space="preserve"/>
       </w:r>
       <w:r>
         <w:rPr>
           <w:rFonts w:ascii="Courier" w:hAnsi="Courier"/>
         </w:rPr>
-        <w:t>docs/SPEC.md</w:t>
-      </w:r>
-      <w:r>
-        <w:t xml:space="preserve">, </w:t>
+        <w:t xml:space="preserve"/>
+      </w:r>
+      <w:r>
+        <w:t xml:space="preserve"/>
       </w:r>
       <w:r>
         <w:rPr>
           <w:rFonts w:ascii="Courier" w:hAnsi="Courier"/>
         </w:rPr>
-        <w:t>docs/SETUP.md</w:t>
-      </w:r>
-      <w:r>
-        <w:t xml:space="preserve">, </w:t>
+        <w:t xml:space="preserve"/>
+      </w:r>
+      <w:r>
+        <w:t xml:space="preserve"/>
       </w:r>
       <w:r>
         <w:rPr>
           <w:rFonts w:ascii="Courier" w:hAnsi="Courier"/>
         </w:rPr>
-        <w:t>data/crm/leads.example.csv</w:t>
-      </w:r>
-      <w:r>
-        <w:t>).</w:t>
+        <w:t xml:space="preserve"/>
+      </w:r>
+      <w:r>
+        <w:t xml:space="preserve"/>
       </w:r>
       <w:r/>
     </w:p>
@@ -1385,16 +1385,16 @@
     <w:p>
       <w:r/>
       <w:r>
-        <w:t xml:space="preserve">{{COMPANY_NAME}} verarbeitet als B2B-Fertigungsbetrieb (CNC-Fräsen / Lohnfertigung) überwiegend Kunden-, Auftrags-, Lieferanten- und Beschäftigtendaten sowie Website-Besucherdaten. Das Datenschutzniveau ist in Teilbereichen solide (DSGVO-bewusste Trennung von Rohdaten und Code, kein Datenverkauf, überschaubare Verarbeitungslandschaft), es fehlen jedoch </w:t>
+        <w:t xml:space="preserve">{{COMPANY_NAME}} verarbeitet als B2B-Dienstleister für Kaltfräsarbeiten im Straßen- und Tiefbau (Asphalt-/Betonfräsen, Grinding &amp; Grooving) überwiegend Kunden-, Auftrags-, Lieferanten- und Beschäftigtendaten sowie Website-Besucherdaten. Das Datenschutzniveau ist in Teilbereichen solide (DSGVO-bewusste Trennung von Rohdaten und Code, kein Datenverkauf, überschaubare Verarbeitungslandschaft), es fehlen jedoch zentrale Pflichtdokumente und Nachweise.</w:t>
       </w:r>
       <w:r>
         <w:rPr>
           <w:b/>
         </w:rPr>
-        <w:t>zentrale Pflichtdokumente und Nachweise</w:t>
-      </w:r>
-      <w:r>
-        <w:t>.</w:t>
+        <w:t xml:space="preserve"/>
+      </w:r>
+      <w:r>
+        <w:t xml:space="preserve"/>
       </w:r>
       <w:r/>
     </w:p>
@@ -1589,46 +1589,46 @@
         <w:rPr>
           <w:b/>
         </w:rPr>
-        <w:t>Verifiziert (aus interner Codebasis):</w:t>
-      </w:r>
-      <w:r>
-        <w:t xml:space="preserve"> Auftritt als „E. Feind GmbH" / „Fräsdienst Feind", Domain </w:t>
+        <w:t xml:space="preserve">Verifiziert (Website fraesdienst-feind.de, Notion Marketing-Scan 09/2026): Auftritt als „E. Feind GmbH" / „Fräsdienst Feind", Domain fraesdienst-feind.de. Geschäftsfelder: Kaltfräsen von Asphalt und Beton (Straßen, Autobahnen, Gewerbe-/Industrieflächen, Flughäfen), Grinding &amp; Grooving, Pflasterschleifen, Sonderlösungen und Rundum-Service (Fräsgutaufnahme, Kehrsauger). Über 30 Wirtgen-Fräsmaschinen. Hauptsitz Lübben (Brandenburg), Niederlassung Wittenburg (Mecklenburg-Vorpommern), Einsatz deutschlandweit. Auftraggeber: Straßen-/Tiefbauunternehmen, Kommunen, Flughäfen, Industrie. Lead-Quellen: Website-Kontaktformular, Telefon, E-Mail, Ausschreibungen, Empfehlung, Messe.</w:t>
+      </w:r>
+      <w:r>
+        <w:t xml:space="preserve"/>
       </w:r>
       <w:r>
         <w:rPr>
           <w:rFonts w:ascii="Courier" w:hAnsi="Courier"/>
         </w:rPr>
-        <w:t>fraesdienst-feind.de</w:t>
-      </w:r>
-      <w:r>
-        <w:t xml:space="preserve">. Geschäftsfelder: </w:t>
+        <w:t xml:space="preserve"/>
+      </w:r>
+      <w:r>
+        <w:t xml:space="preserve"/>
       </w:r>
       <w:r>
         <w:rPr>
           <w:b/>
         </w:rPr>
-        <w:t>CNC-Fräsen, Lohnfertigung</w:t>
-      </w:r>
-      <w:r>
-        <w:t xml:space="preserve">, Werkstoffe (Aluminium, Kunststoff, Edelstahl, POM, Messing, Titan), </w:t>
+        <w:t xml:space="preserve"/>
+      </w:r>
+      <w:r>
+        <w:t xml:space="preserve"/>
       </w:r>
       <w:r>
         <w:rPr>
           <w:b/>
         </w:rPr>
-        <w:t>Prototypen &amp; Kleinserien</w:t>
-      </w:r>
-      <w:r>
-        <w:t>, Fokus</w:t>
+        <w:t xml:space="preserve"/>
+      </w:r>
+      <w:r>
+        <w:t xml:space="preserve"/>
       </w:r>
       <w:r>
         <w:rPr>
           <w:b/>
         </w:rPr>
-        <w:t>NRW / Deutschland</w:t>
-      </w:r>
-      <w:r>
-        <w:t>. Lead-Quellen: Website-Kontaktformular, Telefon, Messe, E-Mail, Empfehlung.</w:t>
+        <w:t xml:space="preserve"/>
+      </w:r>
+      <w:r>
+        <w:t xml:space="preserve"/>
       </w:r>
       <w:r/>
       <w:r/>
@@ -1671,28 +1671,28 @@
         <w:rPr>
           <w:b/>
         </w:rPr>
-        <w:t>Annahme:</w:t>
-      </w:r>
-      <w:r>
-        <w:t xml:space="preserve"> Sitz/Verarbeitung in </w:t>
+        <w:t xml:space="preserve">Annahme: Hauptsitz und Verarbeitung in Lübben (Brandenburg) → Aufsichtsbehörde LDA Brandenburg (Landesbeauftragte für den Datenschutz und für das Recht auf Akteneinsicht Brandenburg); für die Niederlassung Wittenburg ggf. LfDI Mecklenburg-Vorpommern (Zuständigkeit bei Meldung verifizieren).</w:t>
+      </w:r>
+      <w:r>
+        <w:t xml:space="preserve"/>
       </w:r>
       <w:r>
         <w:rPr>
           <w:b/>
         </w:rPr>
-        <w:t>NRW</w:t>
-      </w:r>
-      <w:r>
-        <w:t xml:space="preserve"> → Aufsichtsbehörde </w:t>
+        <w:t xml:space="preserve"/>
+      </w:r>
+      <w:r>
+        <w:t xml:space="preserve"/>
       </w:r>
       <w:r>
         <w:rPr>
           <w:b/>
         </w:rPr>
-        <w:t>LDI NRW</w:t>
-      </w:r>
-      <w:r>
-        <w:t xml:space="preserve"> (bei Meldung Bundesland verifizieren).</w:t>
+        <w:t xml:space="preserve"/>
+      </w:r>
+      <w:r>
+        <w:t xml:space="preserve"/>
       </w:r>
       <w:r/>
     </w:p>
@@ -3145,7 +3145,7 @@
           </w:tcPr>
           <w:p>
             <w:r>
-              <w:t>Name, Firma, Funktion, Anschrift, E-Mail, Telefon, Auftrags-, Rechnungs-/Zahlungsdaten, techn. Zeichnungen/CAD (i. d. R. kein Personenbezug, aber vertraulich).</w:t>
+              <w:t xml:space="preserve">Name, Firma, Funktion, Anschrift, E-Mail, Telefon, Auftrags-, Rechnungs-/Zahlungsdaten, Ausschreibungsunterlagen, Leistungsverzeichnisse, Lagepläne, Baustellenfotos (i. d. R. kein Personenbezug, aber vertraulich).</w:t>
             </w:r>
           </w:p>
         </w:tc>
@@ -3471,7 +3471,7 @@
           </w:tcPr>
           <w:p>
             <w:r>
-              <w:t>Angebot, Vertrag, Fertigung, Rechnung</w:t>
+              <w:t xml:space="preserve">Angebot, Vertrag, Ausführung auf der Baustelle, Rechnung</w:t>
             </w:r>
           </w:p>
         </w:tc>
@@ -3521,7 +3521,7 @@
           </w:tcPr>
           <w:p>
             <w:r>
-              <w:t>GF, Vertrieb, Buchhaltung, Fertigung</w:t>
+              <w:t xml:space="preserve">GF, Vertrieb, Buchhaltung, Bauleitung/Disposition</w:t>
             </w:r>
           </w:p>
         </w:tc>
@@ -3531,7 +3531,7 @@
           </w:tcPr>
           <w:p>
             <w:r>
-              <w:t>Steuerberater, Versand, Zahlungsdienstl.</w:t>
+              <w:t xml:space="preserve">Steuerberater, Subunternehmer/Entsorger, Zahlungsdienstl.</w:t>
             </w:r>
           </w:p>
         </w:tc>
@@ -4268,10 +4268,10 @@
         <w:rPr>
           <w:b/>
         </w:rPr>
-        <w:t>Eingang:</w:t>
-      </w:r>
-      <w:r>
-        <w:t xml:space="preserve"> Website-Kontaktformular · E-Mail · Telefon · Messe/persönlich · Papierdokumente (Zeichnungen, Lieferscheine) · Bewerbungen · Maschinen-/Fertigungsdaten (CAD — i. d. R. kein Personenbezug).</w:t>
+        <w:t xml:space="preserve">Eingang: Website-Kontaktformular · E-Mail · Telefon · Messe/persönlich · Papierdokumente (Leistungsverzeichnisse, Lieferscheine, Aufmaße) · Bewerbungen · Ausschreibungs-/Planunterlagen (Lagepläne — i. d. R. kein Personenbezug) · Maschinen-/Telematikdaten der Fräsmaschinen und Fahrzeuge (Offene Frage: Fahrer-/Standortbezug → ggf. Beschäftigtendaten, Betriebsvereinbarung prüfen).</w:t>
+      </w:r>
+      <w:r>
+        <w:t xml:space="preserve"/>
       </w:r>
       <w:r/>
     </w:p>
@@ -4281,28 +4281,28 @@
         <w:rPr>
           <w:b/>
         </w:rPr>
-        <w:t>Ausgang:</w:t>
-      </w:r>
-      <w:r>
-        <w:t xml:space="preserve"> Steuerberater/Lohnbüro · Finanzamt/SV-Träger (gesetzlich) · Versand/Logistik · Zahlungsdienstleister/Bank · Google (Analytics/Search Console) · Hosting-Provider · IT-Support/Fernwartung · ggf. Newsletter-Tools · GitHub (nur Code/Konfiguration, </w:t>
+        <w:t xml:space="preserve">Ausgang: Steuerberater/Lohnbüro · Finanzamt/SV-Träger (gesetzlich) · Subunternehmer/Entsorgung/Logistik · Zahlungsdienstleister/Bank · Google (Analytics/Search Console) · Hosting-Provider · IT-Support/Fernwartung · ggf. Newsletter-Tools · GitHub (nur Code/Konfiguration, keineproduktiven CRM-Rohdaten — durch .gitignore ausgeschlossen).</w:t>
+      </w:r>
+      <w:r>
+        <w:t xml:space="preserve"/>
       </w:r>
       <w:r>
         <w:rPr>
           <w:b/>
         </w:rPr>
-        <w:t>keine</w:t>
-      </w:r>
-      <w:r>
-        <w:t xml:space="preserve">produktiven CRM-Rohdaten — durch </w:t>
+        <w:t xml:space="preserve"/>
+      </w:r>
+      <w:r>
+        <w:t xml:space="preserve"/>
       </w:r>
       <w:r>
         <w:rPr>
           <w:rFonts w:ascii="Courier" w:hAnsi="Courier"/>
         </w:rPr>
-        <w:t>.gitignore</w:t>
-      </w:r>
-      <w:r>
-        <w:t xml:space="preserve"> ausgeschlossen).</w:t>
+        <w:t xml:space="preserve"/>
+      </w:r>
+      <w:r>
+        <w:t xml:space="preserve"/>
       </w:r>
       <w:r/>
     </w:p>
@@ -4460,7 +4460,7 @@
           </w:tcPr>
           <w:p>
             <w:r>
-              <w:t>Angebot→Fertigung→Rechnung</w:t>
+              <w:t xml:space="preserve">Angebot→Ausführung→Rechnung</w:t>
             </w:r>
           </w:p>
         </w:tc>
@@ -4470,7 +4470,7 @@
           </w:tcPr>
           <w:p>
             <w:r>
-              <w:t>Steuerberater, Versand</w:t>
+              <w:t xml:space="preserve">Steuerberater, Subunternehmer</w:t>
             </w:r>
           </w:p>
         </w:tc>
@@ -6371,7 +6371,7 @@
               <w:rPr>
                 <w:b/>
               </w:rPr>
-              <w:t>Versand/Logistik</w:t>
+              <w:t xml:space="preserve">Subunternehmer/Entsorger/Logistik</w:t>
             </w:r>
           </w:p>
         </w:tc>
@@ -6381,7 +6381,7 @@
           </w:tcPr>
           <w:p>
             <w:r>
-              <w:t>Warenversand</w:t>
+              <w:t xml:space="preserve">Baustellenlogistik, Fräsgut-Entsorgung</w:t>
             </w:r>
           </w:p>
         </w:tc>
@@ -6737,25 +6737,25 @@
     <w:p>
       <w:r/>
       <w:r>
-        <w:t xml:space="preserve">Vollständige </w:t>
+        <w:t xml:space="preserve">Vollständige DPIA-Vorlage mit Beispielen (Kundenverwaltung, Ausschreibungs-/Planunterlagen, Fernwartung) sieheAnhang B.</w:t>
       </w:r>
       <w:r>
         <w:rPr>
           <w:b/>
         </w:rPr>
-        <w:t>DPIA-Vorlage mit Beispielen</w:t>
-      </w:r>
-      <w:r>
-        <w:t xml:space="preserve"> (Kundenverwaltung, CAD-Dateien, Fernwartung) siehe</w:t>
+        <w:t xml:space="preserve"/>
+      </w:r>
+      <w:r>
+        <w:t xml:space="preserve"/>
       </w:r>
       <w:r>
         <w:rPr>
           <w:b/>
         </w:rPr>
-        <w:t>Anhang B</w:t>
-      </w:r>
-      <w:r>
-        <w:t>.</w:t>
+        <w:t xml:space="preserve"/>
+      </w:r>
+      <w:r>
+        <w:t xml:space="preserve"/>
       </w:r>
       <w:r/>
       <w:r/>
@@ -6843,19 +6843,19 @@
         <w:rPr>
           <w:b/>
         </w:rPr>
-        <w:t>Meldung an Aufsichtsbehörde (Art. 33):</w:t>
-      </w:r>
-      <w:r>
-        <w:t xml:space="preserve"> bei Risiko </w:t>
+        <w:t xml:space="preserve">Meldung an Aufsichtsbehörde (Art. 33): bei Risiko innerhalb 72 Stunden (LDA Brandenburg); Verzögerung begründen.</w:t>
+      </w:r>
+      <w:r>
+        <w:t xml:space="preserve"/>
       </w:r>
       <w:r>
         <w:rPr>
           <w:b/>
         </w:rPr>
-        <w:t>innerhalb 72 Stunden</w:t>
-      </w:r>
-      <w:r>
-        <w:t xml:space="preserve"> (LDI NRW); Verzögerung begründen.</w:t>
+        <w:t xml:space="preserve"/>
+      </w:r>
+      <w:r>
+        <w:t xml:space="preserve"/>
       </w:r>
       <w:r/>
     </w:p>
@@ -11057,25 +11057,25 @@
         <w:rPr>
           <w:rFonts w:ascii="Courier" w:hAnsi="Courier"/>
         </w:rPr>
-        <w:t>Nr;Verarbeitungstaetigkeit;Zweck;Rechtsgrundlage;Betroffenengruppe;Datenkategorien;Empfaenger;Drittland;Loeschfrist;TOM;Verantwortlich</w:t>
+        <w:t xml:space="preserve">Nr;Verarbeitungstaetigkeit;Zweck;Rechtsgrundlage;Betroffenengruppe;Datenkategorien;Empfaenger;Drittland;Loeschfrist;TOM;Verantwortlich1;Kundenverwaltung/Auftragsabwicklung;Vertragserfuellung;Art.6 I b/c;Kunden;Stamm-,Auftrags-,Rechnungsdaten;Steuerberater,Subunternehmer;{{CLOUD_STANDORT}};8-10 J. (AO/HGB) bzw. 3 J. (BGB);Rollenrechte,Backup,Verschluesselung;GF/Vertrieb2;Kontaktformular/Interessenten;Anfragebearbeitung;Art.6 I b/f;Interessenten;Name,Firma,Kontakt,Anliegen;-;{{HOSTING_PROVIDER}};nach Erledigung, max 6-12 Mon.;TLS,Zugriffsschutz;Marketing3;Website-Analyse GA4;Reichweitenanalyse;Art.6 I a (Einwilligung);Website-Besucher;IP,Geraete-/Nutzungsdaten,Cookie-IDs;Google;USA (DPF);GA4-Retention (konfigurierbar);Consent,IP-Kuerzung;Marketing4;Suchperformance Search Console;SEO;Art.6 I f;Website-Besucher;aggregierte Suchdaten;Google;USA (DPF);Google-seitig;Service-Account;Marketing5;Beschaeftigtenverwaltung/Lohn;Personal/Lohn;Art.6 I b/c,§26 BDSG,Art.9 II b;Beschaeftigte;Stamm-,Lohn-,Gesundheitsdaten;{{PAYROLL_PROVIDER}},FA,SV;EU;6-10 J. steuer-/sozialrechtl.;Zugriffsbeschr.,Verschluesselung;GF/Personal6;Bewerbermanagement;Auswahlverfahren;Art.6 I b,§26 BDSG;Bewerber;Bewerbungsdaten;-;EU;6 Mon. nach Absage;Zugriffsschutz,Loeschung;GF/Personal7;Newsletter/Marketing;Direktwerbung;Art.6 I a;Interessenten/Kunden;E-Mail,Name;{{NEWSLETTER_TOOL}};{{NL_DRITTLAND}};bis Widerruf; Consent dauerhaft;Double-Opt-in,Consent-Log;Marketing8;Lieferantenverwaltung;Beschaffung;Art.6 I b/f;Lieferanten;Kontakt-,Vertrags-,Zahlungsdaten;Bank;EU;3 J. nach Vertragsende;Zugriffsschutz;Einkauf/Buchhaltung9;IT-Sicherheit/Server-Logs;Betriebssicherheit;Art.6 I f;Website-Besucher;IP,Zeitstempel;{{HOSTING_PROVIDER}};{{HOST_DRITTLAND}};7-30 Tage;Zugriffsschutz,Loeschautomatik;IT</w:t>
         <w:br/>
-        <w:t>1;Kundenverwaltung/Auftragsabwicklung;Vertragserfuellung;Art.6 I b/c;Kunden;Stamm-,Auftrags-,Rechnungsdaten;Steuerberater,Versand;{{CLOUD_STANDORT}};8-10 J. (AO/HGB) bzw. 3 J. (BGB);Rollenrechte,Backup,Verschluesselung;GF/Vertrieb</w:t>
+        <w:t xml:space="preserve"/>
         <w:br/>
-        <w:t>2;Kontaktformular/Interessenten;Anfragebearbeitung;Art.6 I b/f;Interessenten;Name,Firma,Kontakt,Anliegen;-;{{HOSTING_PROVIDER}};nach Erledigung, max 6-12 Mon.;TLS,Zugriffsschutz;Marketing</w:t>
+        <w:t xml:space="preserve"/>
         <w:br/>
-        <w:t>3;Website-Analyse GA4;Reichweitenanalyse;Art.6 I a (Einwilligung);Website-Besucher;IP,Geraete-/Nutzungsdaten,Cookie-IDs;Google;USA (DPF);GA4-Retention (konfigurierbar);Consent,IP-Kuerzung;Marketing</w:t>
+        <w:t xml:space="preserve"/>
         <w:br/>
-        <w:t>4;Suchperformance Search Console;SEO;Art.6 I f;Website-Besucher;aggregierte Suchdaten;Google;USA (DPF);Google-seitig;Service-Account;Marketing</w:t>
+        <w:t xml:space="preserve"/>
         <w:br/>
-        <w:t>5;Beschaeftigtenverwaltung/Lohn;Personal/Lohn;Art.6 I b/c,§26 BDSG,Art.9 II b;Beschaeftigte;Stamm-,Lohn-,Gesundheitsdaten;{{PAYROLL_PROVIDER}},FA,SV;EU;6-10 J. steuer-/sozialrechtl.;Zugriffsbeschr.,Verschluesselung;GF/Personal</w:t>
+        <w:t xml:space="preserve"/>
         <w:br/>
-        <w:t>6;Bewerbermanagement;Auswahlverfahren;Art.6 I b,§26 BDSG;Bewerber;Bewerbungsdaten;-;EU;6 Mon. nach Absage;Zugriffsschutz,Loeschung;GF/Personal</w:t>
+        <w:t xml:space="preserve"/>
         <w:br/>
-        <w:t>7;Newsletter/Marketing;Direktwerbung;Art.6 I a;Interessenten/Kunden;E-Mail,Name;{{NEWSLETTER_TOOL}};{{NL_DRITTLAND}};bis Widerruf; Consent dauerhaft;Double-Opt-in,Consent-Log;Marketing</w:t>
+        <w:t xml:space="preserve"/>
         <w:br/>
-        <w:t>8;Lieferantenverwaltung;Beschaffung;Art.6 I b/f;Lieferanten;Kontakt-,Vertrags-,Zahlungsdaten;Bank;EU;3 J. nach Vertragsende;Zugriffsschutz;Einkauf/Buchhaltung</w:t>
+        <w:t xml:space="preserve"/>
         <w:br/>
-        <w:t>9;IT-Sicherheit/Server-Logs;Betriebssicherheit;Art.6 I f;Website-Besucher;IP,Zeitstempel;{{HOSTING_PROVIDER}};{{HOST_DRITTLAND}};7-30 Tage;Zugriffsschutz,Loeschautomatik;IT</w:t>
+        <w:t xml:space="preserve"/>
       </w:r>
       <w:r/>
     </w:p>
@@ -11102,50 +11102,50 @@
         <w:rPr>
           <w:rFonts w:ascii="Courier" w:hAnsi="Courier"/>
         </w:rPr>
-        <w:t>DATENSCHUTZ-FOLGENABSCHAETZUNG (Art. 35 DSGVO) - {{COMPANY_NAME}}</w:t>
+        <w:t xml:space="preserve">DATENSCHUTZ-FOLGENABSCHAETZUNG (Art. 35 DSGVO) - {{COMPANY_NAME}}1. Verarbeitung: ................................................2. Verantwortlicher / DSB: {{DPO_CONTACT}}3. Zweck(e): ...................................................4. Datenkategorien / Betroffene: ...............................5. Notwendigkeit &amp; Verhaeltnismaessigkeit: .....................6. Risiken fuer Betroffene:   - Vertraulichkeit (unbefugter Zugriff): .....................   - Integritaet (Veraenderung): ...............................   - Verfuegbarkeit (Verlust): .................................7. Bewertung: Eintritt (1-3) x Schwere (1-3) = Score:8. Abhilfemassnahmen (TOM): ....................................9. Restrisiko: [ ] akzeptabel  [ ] nicht akzeptabel10. Freigabe (GF/DSB), Datum: ..................................11. Naechster Review: ..........................................BEISPIEL 1 - Kundenverwaltung: Risiko mittel; Score 4; Massnahmen: Rollenrechte, MFA, Backup,Verschluesselung; Restrisiko akzeptabel.BEISPIEL 2 - Ausschreibungs-/Planunterlagen (Auftraggeber-Know-how): i.d.R. kein Personenbezug, aber hoheVertraulichkeit; Massnahmen: strenge Zugriffskontrolle, Verschluesselung, NDA; Restrisikoakzeptabel bei Umsetzung.BEISPIEL 3 - Fernwartung: Risiko mittel-hoch; Massnahmen: AVV, Zugriff nur nach Freigabe,Protokollierung, Verschluesselung; Restrisiko akzeptabel.</w:t>
         <w:br/>
-        <w:t>1. Verarbeitung: ................................................</w:t>
+        <w:t xml:space="preserve"/>
         <w:br/>
-        <w:t>2. Verantwortlicher / DSB: {{DPO_CONTACT}}</w:t>
+        <w:t xml:space="preserve"/>
         <w:br/>
-        <w:t>3. Zweck(e): ...................................................</w:t>
+        <w:t xml:space="preserve"/>
         <w:br/>
-        <w:t>4. Datenkategorien / Betroffene: ...............................</w:t>
+        <w:t xml:space="preserve"/>
         <w:br/>
-        <w:t>5. Notwendigkeit &amp; Verhaeltnismaessigkeit: .....................</w:t>
+        <w:t xml:space="preserve"/>
         <w:br/>
-        <w:t>6. Risiken fuer Betroffene:</w:t>
+        <w:t xml:space="preserve"/>
         <w:br/>
-        <w:t xml:space="preserve">   - Vertraulichkeit (unbefugter Zugriff): .....................</w:t>
+        <w:t xml:space="preserve"/>
         <w:br/>
-        <w:t xml:space="preserve">   - Integritaet (Veraenderung): ...............................</w:t>
+        <w:t xml:space="preserve"/>
         <w:br/>
-        <w:t xml:space="preserve">   - Verfuegbarkeit (Verlust): .................................</w:t>
+        <w:t xml:space="preserve"/>
         <w:br/>
-        <w:t>7. Bewertung: Eintritt (1-3) x Schwere (1-3) = Score:</w:t>
+        <w:t xml:space="preserve"/>
         <w:br/>
-        <w:t>8. Abhilfemassnahmen (TOM): ....................................</w:t>
+        <w:t xml:space="preserve"/>
         <w:br/>
-        <w:t>9. Restrisiko: [ ] akzeptabel  [ ] nicht akzeptabel</w:t>
+        <w:t xml:space="preserve"/>
         <w:br/>
-        <w:t>10. Freigabe (GF/DSB), Datum: ..................................</w:t>
+        <w:t xml:space="preserve"/>
         <w:br/>
-        <w:t>11. Naechster Review: ..........................................</w:t>
+        <w:t xml:space="preserve"/>
         <w:br/>
         <w:br/>
-        <w:t>BEISPIEL 1 - Kundenverwaltung: Risiko mittel; Score 4; Massnahmen: Rollenrechte, MFA, Backup,</w:t>
+        <w:t xml:space="preserve"/>
         <w:br/>
-        <w:t>Verschluesselung; Restrisiko akzeptabel.</w:t>
+        <w:t xml:space="preserve"/>
         <w:br/>
-        <w:t>BEISPIEL 2 - CAD-/Fertigungsdaten (Kunden-Know-how): i.d.R. kein Personenbezug, aber hohe</w:t>
+        <w:t xml:space="preserve"/>
         <w:br/>
-        <w:t>Vertraulichkeit; Massnahmen: strenge Zugriffskontrolle, Verschluesselung, NDA; Restrisiko</w:t>
+        <w:t xml:space="preserve"/>
         <w:br/>
-        <w:t>akzeptabel bei Umsetzung.</w:t>
+        <w:t xml:space="preserve"/>
         <w:br/>
-        <w:t>BEISPIEL 3 - Fernwartung: Risiko mittel-hoch; Massnahmen: AVV, Zugriff nur nach Freigabe,</w:t>
+        <w:t xml:space="preserve"/>
         <w:br/>
-        <w:t>Protokollierung, Verschluesselung; Restrisiko akzeptabel.</w:t>
+        <w:t xml:space="preserve"/>
       </w:r>
       <w:r/>
     </w:p>
@@ -11378,60 +11378,60 @@
         <w:rPr>
           <w:rFonts w:ascii="Courier" w:hAnsi="Courier"/>
         </w:rPr>
-        <w:t>1. Verantwortlicher</w:t>
+        <w:t xml:space="preserve">1. Verantwortlicher{{COMPANY_NAME}}, {{ADRESSE}}, {{KONTAKT_EMAIL}}, {{TELEFON}}. [DSB: {{DPO_CONTACT}}, falls vorhanden]2. Ihre RechteAuskunft, Berichtigung, Loeschung, Einschraenkung, Datenuebertragbarkeit, Widerspruch;Beschwerderecht bei der Aufsichtsbehoerde (LDA Brandenburg).3. Server-Logfiles (Art. 6 I f)Beim Aufruf werden IP-Adresse, Datum/Uhrzeit, abgerufene Datei etc. verarbeitet; Speicherung{{LOG_RETENTION}} zur Betriebssicherheit. Hosting durch {{HOSTING_PROVIDER}}.4. Kontaktformular / E-Mail (Art. 6 I b/f)Verarbeitung zur Bearbeitung der Anfrage; Loeschung nach Erledigung, sofern keineAufbewahrungspflicht.5. Cookies &amp; Einwilligung (§ 25 TDDDG, Art. 6 I a)Nicht notwendige Cookies/Technologien nur mit Einwilligung; Widerruf jederzeit.6. Google Analytics 4 (Art. 6 I a)Nur nach Einwilligung; Anbieter Google Ireland/LLC; Uebermittlung USA moeglich (EU-US DataPrivacy Framework); IP-Kuerzung aktiviert; Speicherdauer {{GA4_RETENTION}}.7. Weitere Dienste [{{CMS}} / Google Fonts lokal / Maps / reCAPTCHA / {{NEWSLETTER_TOOL}} etc.][nur auffuehren, was tatsaechlich eingesetzt wird]8. Empfaenger / Auftragsverarbeiter{{HOSTING_PROVIDER}}, IT-Dienstleister, ggf. {{NEWSLETTER_TOOL}} (jeweils mit AVV).9. DrittlandtransferGrundlage DPF/SCC (Art. 44 ff.).10. Stand: {{DATUM}}</w:t>
         <w:br/>
-        <w:t>{{COMPANY_NAME}}, {{ADRESSE}}, {{KONTAKT_EMAIL}}, {{TELEFON}}. [DSB: {{DPO_CONTACT}}, falls vorhanden]</w:t>
+        <w:t xml:space="preserve"/>
         <w:br/>
         <w:br/>
-        <w:t>2. Ihre Rechte</w:t>
+        <w:t xml:space="preserve"/>
         <w:br/>
-        <w:t>Auskunft, Berichtigung, Loeschung, Einschraenkung, Datenuebertragbarkeit, Widerspruch;</w:t>
+        <w:t xml:space="preserve"/>
         <w:br/>
-        <w:t>Beschwerderecht bei der Aufsichtsbehoerde (LDI NRW).</w:t>
+        <w:t xml:space="preserve"/>
         <w:br/>
         <w:br/>
-        <w:t>3. Server-Logfiles (Art. 6 I f)</w:t>
+        <w:t xml:space="preserve"/>
         <w:br/>
-        <w:t>Beim Aufruf werden IP-Adresse, Datum/Uhrzeit, abgerufene Datei etc. verarbeitet; Speicherung</w:t>
+        <w:t xml:space="preserve"/>
         <w:br/>
-        <w:t>{{LOG_RETENTION}} zur Betriebssicherheit. Hosting durch {{HOSTING_PROVIDER}}.</w:t>
+        <w:t xml:space="preserve"/>
         <w:br/>
         <w:br/>
-        <w:t>4. Kontaktformular / E-Mail (Art. 6 I b/f)</w:t>
+        <w:t xml:space="preserve"/>
         <w:br/>
-        <w:t>Verarbeitung zur Bearbeitung der Anfrage; Loeschung nach Erledigung, sofern keine</w:t>
+        <w:t xml:space="preserve"/>
         <w:br/>
-        <w:t>Aufbewahrungspflicht.</w:t>
+        <w:t xml:space="preserve"/>
         <w:br/>
         <w:br/>
-        <w:t>5. Cookies &amp; Einwilligung (§ 25 TDDDG, Art. 6 I a)</w:t>
+        <w:t xml:space="preserve"/>
         <w:br/>
-        <w:t>Nicht notwendige Cookies/Technologien nur mit Einwilligung; Widerruf jederzeit.</w:t>
+        <w:t xml:space="preserve"/>
         <w:br/>
         <w:br/>
-        <w:t>6. Google Analytics 4 (Art. 6 I a)</w:t>
+        <w:t xml:space="preserve"/>
         <w:br/>
-        <w:t>Nur nach Einwilligung; Anbieter Google Ireland/LLC; Uebermittlung USA moeglich (EU-US Data</w:t>
+        <w:t xml:space="preserve"/>
         <w:br/>
-        <w:t>Privacy Framework); IP-Kuerzung aktiviert; Speicherdauer {{GA4_RETENTION}}.</w:t>
+        <w:t xml:space="preserve"/>
         <w:br/>
         <w:br/>
-        <w:t>7. Weitere Dienste [{{CMS}} / Google Fonts lokal / Maps / reCAPTCHA / {{NEWSLETTER_TOOL}} etc.]</w:t>
+        <w:t xml:space="preserve"/>
         <w:br/>
-        <w:t>[nur auffuehren, was tatsaechlich eingesetzt wird]</w:t>
+        <w:t xml:space="preserve"/>
         <w:br/>
         <w:br/>
-        <w:t>8. Empfaenger / Auftragsverarbeiter</w:t>
+        <w:t xml:space="preserve"/>
         <w:br/>
-        <w:t>{{HOSTING_PROVIDER}}, IT-Dienstleister, ggf. {{NEWSLETTER_TOOL}} (jeweils mit AVV).</w:t>
+        <w:t xml:space="preserve"/>
         <w:br/>
         <w:br/>
-        <w:t>9. Drittlandtransfer</w:t>
+        <w:t xml:space="preserve"/>
         <w:br/>
-        <w:t>Grundlage DPF/SCC (Art. 44 ff.).</w:t>
+        <w:t xml:space="preserve"/>
         <w:br/>
         <w:br/>
-        <w:t>10. Stand: {{DATUM}}</w:t>
+        <w:t xml:space="preserve"/>
       </w:r>
       <w:r/>
     </w:p>
@@ -12819,7 +12819,7 @@
           </w:tcPr>
           <w:p>
             <w:r>
-              <w:t>Sitz/Verarbeitung in NRW → Aufsichtsbehörde LDI NRW</w:t>
+              <w:t xml:space="preserve">Hauptsitz Lübben (Brandenburg) → Aufsichtsbehörde LDA Brandenburg; Niederlassung Wittenburg (MV) → ggf. LfDI M-V</w:t>
             </w:r>
           </w:p>
         </w:tc>

</xml_diff>